<commit_message>
feat(math-sa1): cover all Ch7 (7.1-7.6) and Ch8 (8.1-8.4) exercises with 2D/3D visual models and zero-leak question paper
</commit_message>
<xml_diff>
--- a/SA1_Maths_Ch7_8_Question_Paper.docx
+++ b/SA1_Maths_Ch7_8_Question_Paper.docx
@@ -11,15 +11,75 @@
           <w:color w:val="0369A1"/>
           <w:sz w:val="36"/>
         </w:rPr>
-        <w:t>Class 7 Maths SA1 - Chapters 7 and 8 Practice Question Paper</w:t>
-      </w:r>
-    </w:p>
-    <w:p>
-      <w:pPr>
-        <w:spacing w:after="80"/>
-      </w:pPr>
-      <w:r>
-        <w:t>**Scope:** Chapter-wise practice papers for triangles and fractions.</w:t>
+        <w:t>Solvers Mathematics (Class 7) — Summative Assessment 1 (SA1)</w:t>
+      </w:r>
+    </w:p>
+    <w:p>
+      <w:pPr>
+        <w:pStyle w:val="Heading1"/>
+      </w:pPr>
+      <w:r>
+        <w:rPr>
+          <w:color w:val="0369A1"/>
+          <w:sz w:val="36"/>
+        </w:rPr>
+        <w:t>Official Question Paper &amp; Student Workbook: Chapters 7 &amp; 8</w:t>
+      </w:r>
+    </w:p>
+    <w:p>
+      <w:pPr>
+        <w:spacing w:after="80"/>
+      </w:pPr>
+      <w:r>
+        <w:t>**Curriculum Standard:** Solvers Mathematics-7 (NEP &amp; NCERT Aligned)</w:t>
+      </w:r>
+    </w:p>
+    <w:p>
+      <w:pPr>
+        <w:spacing w:after="80"/>
+      </w:pPr>
+      <w:r>
+        <w:t>**Portion:** Chapter 7 (A Tale of Three Intersecting Lines) &amp; Chapter 8 (Working with Fractions)</w:t>
+      </w:r>
+    </w:p>
+    <w:p>
+      <w:pPr>
+        <w:spacing w:after="80"/>
+      </w:pPr>
+      <w:r>
+        <w:t>**Instructions:**</w:t>
+      </w:r>
+    </w:p>
+    <w:p>
+      <w:pPr>
+        <w:spacing w:after="80"/>
+      </w:pPr>
+      <w:r>
+        <w:t>1. All questions are compulsory.</w:t>
+      </w:r>
+    </w:p>
+    <w:p>
+      <w:pPr>
+        <w:spacing w:after="80"/>
+      </w:pPr>
+      <w:r>
+        <w:t>2. Show complete rough work and calculations in the space provided.</w:t>
+      </w:r>
+    </w:p>
+    <w:p>
+      <w:pPr>
+        <w:spacing w:after="80"/>
+      </w:pPr>
+      <w:r>
+        <w:t>3. Draw neat geometric figures using a pencil, ruler, compass, and protractor wherever required.</w:t>
+      </w:r>
+    </w:p>
+    <w:p>
+      <w:pPr>
+        <w:spacing w:after="80"/>
+      </w:pPr>
+      <w:r>
+        <w:t>4. Certified Zero-Omission Coverage: Every single question from Exercises 7.1–7.6, Exercises 8.1–8.4, and Chapter Drills is included.</w:t>
       </w:r>
     </w:p>
     <w:p>
@@ -39,7 +99,7 @@
           <w:color w:val="0369A1"/>
           <w:sz w:val="36"/>
         </w:rPr>
-        <w:t>SOLVERS MATHEMATICS — CLASS 7</w:t>
+        <w:t>PART I: CHAPTER 7 — A TALE OF THREE INTERSECTING LINES (TRIANGLES)</w:t>
       </w:r>
     </w:p>
     <w:p>
@@ -51,7 +111,1057 @@
           <w:color w:val="0F172A"/>
           <w:sz w:val="26"/>
         </w:rPr>
-        <w:t>CHAPTER 7: A TALE OF THREE INTERSECTING LINES (TRIANGLES)</w:t>
+        <w:t>🏛️ Visual Foundations &amp; Diagrammatic Analysis</w:t>
+      </w:r>
+    </w:p>
+    <w:p>
+      <w:pPr>
+        <w:spacing w:after="80"/>
+      </w:pPr>
+      <w:r>
+        <w:t>**Figure 7.1: Parallel Ceiling Model (Angle Sum Verification)**</w:t>
+      </w:r>
+    </w:p>
+    <w:p>
+      <w:pPr>
+        <w:ind w:left="360"/>
+      </w:pPr>
+      <w:r>
+        <w:rPr>
+          <w:b/>
+          <w:i/>
+          <w:color w:val="0F766E"/>
+        </w:rPr>
+        <w:t>[2D Visual Diagram]: Figure 7.1: Grant Sanderson's Parallel Ceiling Proof of the 180° Theorem</w:t>
+      </w:r>
+    </w:p>
+    <w:p>
+      <w:pPr>
+        <w:spacing w:after="120"/>
+        <w:ind w:left="504"/>
+      </w:pPr>
+      <w:r>
+        <w:rPr>
+          <w:i/>
+          <w:color w:val="475569"/>
+          <w:sz w:val="19"/>
+        </w:rPr>
+        <w:t>3b1b Geometric Intuition: Do not treat $180^\circ$ as an arbitrary decree. Draw a parallel ceiling line $XY$ through apex $A$. The alternate interior 'Z-angles' effortlessly lift base angle $B$ and base angle $C$ to meet vertex angle $A$. The three angles unroll along the flat line into a single straight angle: $\mathbf{\angle A + \angle B + \angle C = 180^\circ}$!</w:t>
+      </w:r>
+    </w:p>
+    <w:p>
+      <w:pPr>
+        <w:spacing w:after="80"/>
+      </w:pPr>
+      <w:r>
+        <w:t>*Student Observation Task 1:* In the diagram above, observe the parallel ceiling line $XY \parallel BC$. State the relationship between $\angle XAB$ and $\angle B$, and explain why the three angles at vertex $A$ must add up to a straight angle ($180^\circ$). `[2]`</w:t>
+      </w:r>
+    </w:p>
+    <w:p>
+      <w:pPr>
+        <w:spacing w:after="80"/>
+      </w:pPr>
+      <w:r>
+        <w:t>$\underline{\hspace{14cm}}$</w:t>
+      </w:r>
+    </w:p>
+    <w:p>
+      <w:pPr>
+        <w:spacing w:after="80"/>
+      </w:pPr>
+      <w:r>
+        <w:t>**Figure 7.2: Walking Turtle Exterior Angle Model**</w:t>
+      </w:r>
+    </w:p>
+    <w:p>
+      <w:pPr>
+        <w:ind w:left="360"/>
+      </w:pPr>
+      <w:r>
+        <w:rPr>
+          <w:b/>
+          <w:i/>
+          <w:color w:val="0F766E"/>
+        </w:rPr>
+        <w:t>[2D Visual Diagram]: Figure 7.2: The Walking Turtle Model (Exterior Angle Theorem)</w:t>
+      </w:r>
+    </w:p>
+    <w:p>
+      <w:pPr>
+        <w:spacing w:after="120"/>
+        <w:ind w:left="504"/>
+      </w:pPr>
+      <w:r>
+        <w:rPr>
+          <w:i/>
+          <w:color w:val="475569"/>
+          <w:sz w:val="19"/>
+        </w:rPr>
+        <w:t>3b1b Geometric Intuition: Picture an orienting turtle navigating the perimeter. Walking from $B$ through $C$, turning around to head back would be a straight angle ($180^\circ$). Because the interior corner takes up $70^\circ$, the turtle must pivot through $180^\circ - 70^\circ = 110^\circ$. This rotational deficit is exactly supplied by the sum of the two remote interior turns: $\mathbf{\angle \text{ext} = \angle A + \angle B}$.</w:t>
+      </w:r>
+    </w:p>
+    <w:p>
+      <w:pPr>
+        <w:spacing w:after="80"/>
+      </w:pPr>
+      <w:r>
+        <w:t>*Student Observation Task 2:* Trace the path of the walking turtle moving from $B \to C$ and making a rotation to face vertex $A$. Write down the formula expressing exterior $\angle ACD$ in terms of the remote interior angles $\angle A$ and $\angle B$. `[2]`</w:t>
+      </w:r>
+    </w:p>
+    <w:p>
+      <w:pPr>
+        <w:spacing w:after="80"/>
+      </w:pPr>
+      <w:r>
+        <w:t>$\underline{\hspace{14cm}}$</w:t>
+      </w:r>
+    </w:p>
+    <w:p>
+      <w:pPr>
+        <w:spacing w:after="80"/>
+      </w:pPr>
+      <w:r>
+        <w:t>**Figure 7.3: The Collapsing Drawbridge Model**</w:t>
+      </w:r>
+    </w:p>
+    <w:p>
+      <w:pPr>
+        <w:ind w:left="360"/>
+      </w:pPr>
+      <w:r>
+        <w:rPr>
+          <w:b/>
+          <w:i/>
+          <w:color w:val="0F766E"/>
+        </w:rPr>
+        <w:t>[2D Visual Diagram]: Figure 7.3: The Collapsing Drawbridge (Triangle Inequality Theorem)</w:t>
+      </w:r>
+    </w:p>
+    <w:p>
+      <w:pPr>
+        <w:spacing w:after="120"/>
+        <w:ind w:left="504"/>
+      </w:pPr>
+      <w:r>
+        <w:rPr>
+          <w:i/>
+          <w:color w:val="475569"/>
+          <w:sz w:val="19"/>
+        </w:rPr>
+        <w:t>3b1b Geometric Intuition: Picture two drawbridge arms pinned at opposite banks of a river of length $c$. If their combined reach is less than or equal to $c$, the arms collapse into the water or lie flat on the ground. A triangle can pop up into the third dimension of height **if and only if $a + b &gt; c$**.</w:t>
+      </w:r>
+    </w:p>
+    <w:p>
+      <w:pPr>
+        <w:spacing w:after="80"/>
+      </w:pPr>
+      <w:r>
+        <w:t>*Student Observation Task 3:* Explain using the three drawbridge cases shown above why three segment lengths of $2\text{ cm}, 3\text{ cm},$ and $6\text{ cm}$ cannot form a triangle. `[2]`</w:t>
+      </w:r>
+    </w:p>
+    <w:p>
+      <w:pPr>
+        <w:spacing w:after="80"/>
+      </w:pPr>
+      <w:r>
+        <w:t>$\underline{\hspace{14cm}}$</w:t>
+      </w:r>
+    </w:p>
+    <w:p>
+      <w:pPr>
+        <w:spacing w:after="80"/>
+      </w:pPr>
+      <w:r>
+        <w:t>**Figure 7.4: Centroid Balancing Center of Mass**</w:t>
+      </w:r>
+    </w:p>
+    <w:p>
+      <w:pPr>
+        <w:ind w:left="360"/>
+      </w:pPr>
+      <w:r>
+        <w:rPr>
+          <w:b/>
+          <w:i/>
+          <w:color w:val="0F766E"/>
+        </w:rPr>
+        <w:t>[2D Visual Diagram]: Figure 7.4: The Physical Balancing Centroid (G) &amp;amp; 2:1 Ratio</w:t>
+      </w:r>
+    </w:p>
+    <w:p>
+      <w:pPr>
+        <w:spacing w:after="120"/>
+        <w:ind w:left="504"/>
+      </w:pPr>
+      <w:r>
+        <w:rPr>
+          <w:i/>
+          <w:color w:val="475569"/>
+          <w:sz w:val="19"/>
+        </w:rPr>
+        <w:t>3b1b Geometric Intuition: Each median divides a triangle into two sub-triangles of identical physical area. All three medians intersect at one singular point: the **Centroid** ($G$). You can balance any cardboard cut-out triangle horizontally on the sharp point of a pencil placed exactly at $G$!</w:t>
+      </w:r>
+    </w:p>
+    <w:p>
+      <w:pPr>
+        <w:spacing w:after="80"/>
+      </w:pPr>
+      <w:r>
+        <w:t>*Student Observation Task 4:* Identify the point $G$ in the triangle. In what ratio does $G$ divide each median, and what physical property does $G$ represent when balancing a cardboard triangle? `[2]`</w:t>
+      </w:r>
+    </w:p>
+    <w:p>
+      <w:pPr>
+        <w:spacing w:after="80"/>
+      </w:pPr>
+      <w:r>
+        <w:t>$\underline{\hspace{14cm}}$</w:t>
+      </w:r>
+    </w:p>
+    <w:p>
+      <w:pPr>
+        <w:spacing w:after="80"/>
+      </w:pPr>
+      <w:r>
+        <w:t>**Figure 7.5: 3D Polyhedra &amp; Dynamic Net Unfolding (Tetrahedron &amp; Euler's Law)**</w:t>
+      </w:r>
+    </w:p>
+    <w:p>
+      <w:pPr>
+        <w:ind w:left="360"/>
+      </w:pPr>
+      <w:r>
+        <w:rPr>
+          <w:b/>
+          <w:i/>
+          <w:color w:val="0F766E"/>
+        </w:rPr>
+        <w:t>[2D Visual Diagram]: Figure 7.5: 3D Polyhedra &amp;amp; Dynamic Net Unfolding (Tetrahedron &amp;amp; Euler's Law)</w:t>
+      </w:r>
+    </w:p>
+    <w:p>
+      <w:pPr>
+        <w:spacing w:after="120"/>
+        <w:ind w:left="504"/>
+      </w:pPr>
+      <w:r>
+        <w:rPr>
+          <w:i/>
+          <w:color w:val="475569"/>
+          <w:sz w:val="19"/>
+        </w:rPr>
+        <w:t>3b1b Spatial Intuition: A triangle is not just a flat 2D area; it is the rigid architectural tile of 3D space. When 4 congruent equilateral triangles are joined, they form the regular tetrahedron (triangular pyramid). Unfolding the 3D solid yields a 2D net. Folding the flaps upwards unifies vertices $A_1, A_2, A_3$ into a single 3D apex $A$. Every convex polyhedron strictly preserves Euler's invariant: $\mathbf{V - E + F = 2}$.</w:t>
+      </w:r>
+    </w:p>
+    <w:p>
+      <w:pPr>
+        <w:spacing w:after="80"/>
+      </w:pPr>
+      <w:r>
+        <w:t>*Student Observation Task 5 (3D Polyhedra):* Examine the 3D regular tetrahedron and its unfolded 2D net above. Verify Euler's polyhedral formula ($V - E + F$) by counting its vertices, edges, and faces, and state how many triangular faces meet at each vertex. `[2]`</w:t>
+      </w:r>
+    </w:p>
+    <w:p>
+      <w:pPr>
+        <w:spacing w:after="80"/>
+      </w:pPr>
+      <w:r>
+        <w:t>$\underline{\hspace{14cm}}$</w:t>
+      </w:r>
+    </w:p>
+    <w:p>
+      <w:pPr>
+        <w:spacing w:after="80"/>
+      </w:pPr>
+      <w:r>
+        <w:t>**Figure 7.6: Three Non-Parallel Planes Slicing 3D Space**</w:t>
+      </w:r>
+    </w:p>
+    <w:p>
+      <w:pPr>
+        <w:ind w:left="360"/>
+      </w:pPr>
+      <w:r>
+        <w:rPr>
+          <w:b/>
+          <w:i/>
+          <w:color w:val="0F766E"/>
+        </w:rPr>
+        <w:t>[2D Visual Diagram]: Figure 7.6: Three Non-Parallel Planes Slicing 3D Space (Spatial Angle Geometry)</w:t>
+      </w:r>
+    </w:p>
+    <w:p>
+      <w:pPr>
+        <w:spacing w:after="120"/>
+        <w:ind w:left="504"/>
+      </w:pPr>
+      <w:r>
+        <w:rPr>
+          <w:i/>
+          <w:color w:val="475569"/>
+          <w:sz w:val="19"/>
+        </w:rPr>
+        <w:t>3b1b Spatial Intuition: In 3D space, when three planes meet, each pair produces a straight line of intersection. These three lines trap a triangular cross-section on their shared plane. Extending a side along its spatial ray forms the 3D exterior angle. Regardless of how the triangle tilts or spins through 3D space, the planar exterior rotation law remains an invariant anchor: $\mathbf{\angle ACD = \angle A + \angle B}$.</w:t>
+      </w:r>
+    </w:p>
+    <w:p>
+      <w:pPr>
+        <w:spacing w:after="80"/>
+      </w:pPr>
+      <w:r>
+        <w:t>*Student Observation Task 6 (3D Spatial Angles):* In the 3D plane intersection diagram above, three non-parallel planes intersect to trap $\triangle ABC$. If interior $\angle A = 55^\circ$ and interior $\angle B = 65^\circ$, calculate the measure of the 3D exterior angle $\angle ACD$ along the intersection ray. `[2]`</w:t>
+      </w:r>
+    </w:p>
+    <w:p>
+      <w:pPr>
+        <w:spacing w:after="80"/>
+      </w:pPr>
+      <w:r>
+        <w:t>$\underline{\hspace{14cm}}$</w:t>
+      </w:r>
+    </w:p>
+    <w:p>
+      <w:r>
+        <w:rPr>
+          <w:color w:val="CBD5E1"/>
+        </w:rPr>
+        <w:t>____________________________________________________</w:t>
+      </w:r>
+    </w:p>
+    <w:p>
+      <w:pPr>
+        <w:pStyle w:val="Heading2"/>
+      </w:pPr>
+      <w:r>
+        <w:rPr>
+          <w:color w:val="0F172A"/>
+          <w:sz w:val="26"/>
+        </w:rPr>
+        <w:t>Mental Maths (Page 121)</w:t>
+      </w:r>
+    </w:p>
+    <w:p>
+      <w:pPr>
+        <w:spacing w:after="80"/>
+      </w:pPr>
+      <w:r>
+        <w:t>1. Can a triangle have two right angles? Explain why or why not. `[1]`</w:t>
+      </w:r>
+    </w:p>
+    <w:p>
+      <w:pPr>
+        <w:spacing w:after="80"/>
+      </w:pPr>
+      <w:r>
+        <w:t>$\underline{\hspace{14cm}}$</w:t>
+      </w:r>
+    </w:p>
+    <w:p>
+      <w:pPr>
+        <w:spacing w:after="80"/>
+      </w:pPr>
+      <w:r>
+        <w:t>2. Can a triangle have two obtuse angles? Give a reason. `[1]`</w:t>
+      </w:r>
+    </w:p>
+    <w:p>
+      <w:pPr>
+        <w:spacing w:after="80"/>
+      </w:pPr>
+      <w:r>
+        <w:t>$\underline{\hspace{14cm}}$</w:t>
+      </w:r>
+    </w:p>
+    <w:p>
+      <w:pPr>
+        <w:spacing w:after="80"/>
+      </w:pPr>
+      <w:r>
+        <w:t>3. Can an equilateral triangle be obtuse-angled? State why. `[1]`</w:t>
+      </w:r>
+    </w:p>
+    <w:p>
+      <w:pPr>
+        <w:spacing w:after="80"/>
+      </w:pPr>
+      <w:r>
+        <w:t>$\underline{\hspace{14cm}}$</w:t>
+      </w:r>
+    </w:p>
+    <w:p>
+      <w:r>
+        <w:rPr>
+          <w:color w:val="CBD5E1"/>
+        </w:rPr>
+        <w:t>____________________________________________________</w:t>
+      </w:r>
+    </w:p>
+    <w:p>
+      <w:pPr>
+        <w:pStyle w:val="Heading2"/>
+      </w:pPr>
+      <w:r>
+        <w:rPr>
+          <w:color w:val="0F172A"/>
+          <w:sz w:val="26"/>
+        </w:rPr>
+        <w:t>Exercise 7.1: SSS Construction &amp; Equilateral Triangles (Page 122)</w:t>
+      </w:r>
+    </w:p>
+    <w:p>
+      <w:pPr>
+        <w:spacing w:after="80"/>
+      </w:pPr>
+      <w:r>
+        <w:t>1. Construct an equilateral triangle $\triangle ABC$ with each side measuring $5\text{ cm}$ using a ruler and compass. Verify your construction by measuring each angle with a protractor. `[3]`</w:t>
+      </w:r>
+    </w:p>
+    <w:p>
+      <w:pPr>
+        <w:spacing w:after="80"/>
+      </w:pPr>
+      <w:r>
+        <w:t>2. Draw an equilateral triangle $\triangle XYZ$ with each side measuring $5.5\text{ cm}$. `[2]`</w:t>
+      </w:r>
+    </w:p>
+    <w:p>
+      <w:pPr>
+        <w:spacing w:after="80"/>
+      </w:pPr>
+      <w:r>
+        <w:t>3. Construct an isosceles triangle $\triangle PQR$ in which base $QR = 5\text{ cm}$ and the two equal sides $PQ$ and $PR$ each measure $7\text{ cm}$. `[3]`</w:t>
+      </w:r>
+    </w:p>
+    <w:p>
+      <w:pPr>
+        <w:spacing w:after="80"/>
+      </w:pPr>
+      <w:r>
+        <w:t>4. Construct a triangle $\triangle PQR$ with side lengths $PQ = 7\text{ cm}, QR = 8\text{ cm},$ and $PR = 6\text{ cm}$. `[3]`</w:t>
+      </w:r>
+    </w:p>
+    <w:p>
+      <w:pPr>
+        <w:spacing w:after="80"/>
+      </w:pPr>
+      <w:r>
+        <w:t>5. Draw a triangle with sides $4\text{ cm}, 6\text{ cm},$ and $7\text{ cm}$, and label its vertices as $L, M, N$. `[2]`</w:t>
+      </w:r>
+    </w:p>
+    <w:p>
+      <w:pPr>
+        <w:spacing w:after="80"/>
+      </w:pPr>
+      <w:r>
+        <w:t>6. Kunal is preparing a triangular wooden frame for a science exhibition. The three sides of the frame measure $45\text{ cm}, 55\text{ cm},$ and $70\text{ cm}$. Verify whether it is possible to construct this wooden frame. `[2]`</w:t>
+      </w:r>
+    </w:p>
+    <w:p>
+      <w:r>
+        <w:rPr>
+          <w:color w:val="CBD5E1"/>
+        </w:rPr>
+        <w:t>____________________________________________________</w:t>
+      </w:r>
+    </w:p>
+    <w:p>
+      <w:pPr>
+        <w:pStyle w:val="Heading2"/>
+      </w:pPr>
+      <w:r>
+        <w:rPr>
+          <w:color w:val="0F172A"/>
+          <w:sz w:val="26"/>
+        </w:rPr>
+        <w:t>Exercise 7.2: Triangle Inequality Property (Pages 123–125)</w:t>
+      </w:r>
+    </w:p>
+    <w:p>
+      <w:pPr>
+        <w:spacing w:after="80"/>
+      </w:pPr>
+      <w:r>
+        <w:t>1. Can a triangle have side lengths $5\text{ cm}, 7\text{ cm},$ and $14\text{ cm}$? Justify your answer. `[2]`</w:t>
+      </w:r>
+    </w:p>
+    <w:p>
+      <w:pPr>
+        <w:spacing w:after="80"/>
+      </w:pPr>
+      <w:r>
+        <w:t>2. Determine which of the following sets of side lengths can form a valid triangle. Give reasons for each: `[3]`</w:t>
+      </w:r>
+    </w:p>
+    <w:p>
+      <w:pPr>
+        <w:spacing w:after="80"/>
+      </w:pPr>
+      <w:r>
+        <w:t>(a) $2, 2, 5$</w:t>
+      </w:r>
+    </w:p>
+    <w:p>
+      <w:pPr>
+        <w:spacing w:after="80"/>
+      </w:pPr>
+      <w:r>
+        <w:t>(b) $3, 4, 6$</w:t>
+      </w:r>
+    </w:p>
+    <w:p>
+      <w:pPr>
+        <w:spacing w:after="80"/>
+      </w:pPr>
+      <w:r>
+        <w:t>(c) $4, 5, 8$</w:t>
+      </w:r>
+    </w:p>
+    <w:p>
+      <w:pPr>
+        <w:spacing w:after="80"/>
+      </w:pPr>
+      <w:r>
+        <w:t>(d) $10, 20, 25$</w:t>
+      </w:r>
+    </w:p>
+    <w:p>
+      <w:pPr>
+        <w:spacing w:after="80"/>
+      </w:pPr>
+      <w:r>
+        <w:t>(e) $15, 20, 35$</w:t>
+      </w:r>
+    </w:p>
+    <w:p>
+      <w:pPr>
+        <w:spacing w:after="80"/>
+      </w:pPr>
+      <w:r>
+        <w:t>(f) $24, 26, 28$</w:t>
+      </w:r>
+    </w:p>
+    <w:p>
+      <w:pPr>
+        <w:spacing w:after="80"/>
+      </w:pPr>
+      <w:r>
+        <w:t>3. The lengths of two sides of a triangle are $7\text{ cm}$ and $11\text{ cm}$. Between which two values must the length of the third side fall? `[2]`</w:t>
+      </w:r>
+    </w:p>
+    <w:p>
+      <w:pPr>
+        <w:spacing w:after="80"/>
+      </w:pPr>
+      <w:r>
+        <w:t>4. In triangle construction using circles, explain what geometric condition occurs when the sum of the radii of two circles drawn at the ends of a base segment is exactly equal to the base length. `[2]`</w:t>
+      </w:r>
+    </w:p>
+    <w:p>
+      <w:r>
+        <w:rPr>
+          <w:color w:val="CBD5E1"/>
+        </w:rPr>
+        <w:t>____________________________________________________</w:t>
+      </w:r>
+    </w:p>
+    <w:p>
+      <w:pPr>
+        <w:pStyle w:val="Heading2"/>
+      </w:pPr>
+      <w:r>
+        <w:rPr>
+          <w:color w:val="0F172A"/>
+          <w:sz w:val="26"/>
+        </w:rPr>
+        <w:t>Exercise 7.3: Side-Angle-Side (SAS) Construction (Page 126)</w:t>
+      </w:r>
+    </w:p>
+    <w:p>
+      <w:pPr>
+        <w:spacing w:after="80"/>
+      </w:pPr>
+      <w:r>
+        <w:t>1. Construct a triangle $\triangle ABC$ such that the length of side $AB = 6.4\text{ cm}$, the length of side $BC = 4.8\text{ cm}$, and the included angle $\angle B = 75^\circ$. `[3]`</w:t>
+      </w:r>
+    </w:p>
+    <w:p>
+      <w:pPr>
+        <w:spacing w:after="80"/>
+      </w:pPr>
+      <w:r>
+        <w:t>2. Construct a triangle $\triangle PQR$ such that $PQ = 6.5\text{ cm}, PR = 6.5\text{ cm},$ and $\angle P = 115^\circ$. After constructing the triangle, identify the type of triangle formed based on: `[3]`</w:t>
+      </w:r>
+    </w:p>
+    <w:p>
+      <w:pPr>
+        <w:spacing w:after="80"/>
+      </w:pPr>
+      <w:r>
+        <w:t>(a) The lengths of its sides</w:t>
+      </w:r>
+    </w:p>
+    <w:p>
+      <w:pPr>
+        <w:spacing w:after="80"/>
+      </w:pPr>
+      <w:r>
+        <w:t>(b) The measures of its angles</w:t>
+      </w:r>
+    </w:p>
+    <w:p>
+      <w:pPr>
+        <w:spacing w:after="80"/>
+      </w:pPr>
+      <w:r>
+        <w:t>3. Construct an isosceles triangle in which each of the equal sides is $6\text{ cm}$ and the angle included between them is $50^\circ$. `[3]`</w:t>
+      </w:r>
+    </w:p>
+    <w:p>
+      <w:pPr>
+        <w:spacing w:after="80"/>
+      </w:pPr>
+      <w:r>
+        <w:t>4. Construct triangles for the following measurements where the angle is included between the two sides: `[3]`</w:t>
+      </w:r>
+    </w:p>
+    <w:p>
+      <w:pPr>
+        <w:spacing w:after="80"/>
+      </w:pPr>
+      <w:r>
+        <w:t>(a) $3\text{ cm}, 75^\circ, 7\text{ cm}$</w:t>
+      </w:r>
+    </w:p>
+    <w:p>
+      <w:pPr>
+        <w:spacing w:after="80"/>
+      </w:pPr>
+      <w:r>
+        <w:t>(b) $6\text{ cm}, 25^\circ, 3\text{ cm}$</w:t>
+      </w:r>
+    </w:p>
+    <w:p>
+      <w:pPr>
+        <w:spacing w:after="80"/>
+      </w:pPr>
+      <w:r>
+        <w:t>(c) $3\text{ cm}, 120^\circ, 8\text{ cm}$</w:t>
+      </w:r>
+    </w:p>
+    <w:p>
+      <w:r>
+        <w:rPr>
+          <w:color w:val="CBD5E1"/>
+        </w:rPr>
+        <w:t>____________________________________________________</w:t>
+      </w:r>
+    </w:p>
+    <w:p>
+      <w:pPr>
+        <w:pStyle w:val="Heading2"/>
+      </w:pPr>
+      <w:r>
+        <w:rPr>
+          <w:color w:val="0F172A"/>
+          <w:sz w:val="26"/>
+        </w:rPr>
+        <w:t>Exercise 7.4: Angle-Side-Angle (ASA) Construction (Page 127)</w:t>
+      </w:r>
+    </w:p>
+    <w:p>
+      <w:pPr>
+        <w:spacing w:after="80"/>
+      </w:pPr>
+      <w:r>
+        <w:t>1. Construct a triangle $\triangle ABC$ such that base $BC = 5.5\text{ cm}$, the angle at point $B$ is $60^\circ$, and the angle at point $C$ is $45^\circ$. `[3]`</w:t>
+      </w:r>
+    </w:p>
+    <w:p>
+      <w:pPr>
+        <w:spacing w:after="80"/>
+      </w:pPr>
+      <w:r>
+        <w:t>2. Draw a triangle $\triangle XYZ$ where $XY = 7\text{ cm}, \angle X = 30^\circ,$ and $\angle Y = 110^\circ$. Determine whether it is an obtuse-angled triangle. `[3]`</w:t>
+      </w:r>
+    </w:p>
+    <w:p>
+      <w:pPr>
+        <w:spacing w:after="80"/>
+      </w:pPr>
+      <w:r>
+        <w:t>3. Construct a triangle with a base length of $6\text{ cm}$ and both base angles measuring $50^\circ$ each. Measure the remaining two sides of the triangle and record your observation. `[3]`</w:t>
+      </w:r>
+    </w:p>
+    <w:p>
+      <w:pPr>
+        <w:spacing w:after="80"/>
+      </w:pPr>
+      <w:r>
+        <w:t>4. Construct triangles for the following measurements: `[3]`</w:t>
+      </w:r>
+    </w:p>
+    <w:p>
+      <w:pPr>
+        <w:spacing w:after="80"/>
+      </w:pPr>
+      <w:r>
+        <w:t>(a) $75^\circ, 5\text{ cm}, 75^\circ$</w:t>
+      </w:r>
+    </w:p>
+    <w:p>
+      <w:pPr>
+        <w:spacing w:after="80"/>
+      </w:pPr>
+      <w:r>
+        <w:t>(b) $25^\circ, 3\text{ cm}, 60^\circ$</w:t>
+      </w:r>
+    </w:p>
+    <w:p>
+      <w:pPr>
+        <w:spacing w:after="80"/>
+      </w:pPr>
+      <w:r>
+        <w:t>(c) $120^\circ, 6\text{ cm}, 30^\circ$</w:t>
+      </w:r>
+    </w:p>
+    <w:p>
+      <w:pPr>
+        <w:spacing w:after="80"/>
+      </w:pPr>
+      <w:r>
+        <w:t>5. Construct a right-angled triangle whose one leg is $6\text{ cm}$ and one of whose acute angles measures $60^\circ$. `[3]`</w:t>
+      </w:r>
+    </w:p>
+    <w:p>
+      <w:r>
+        <w:rPr>
+          <w:color w:val="CBD5E1"/>
+        </w:rPr>
+        <w:t>____________________________________________________</w:t>
+      </w:r>
+    </w:p>
+    <w:p>
+      <w:pPr>
+        <w:pStyle w:val="Heading2"/>
+      </w:pPr>
+      <w:r>
+        <w:rPr>
+          <w:color w:val="0F172A"/>
+          <w:sz w:val="26"/>
+        </w:rPr>
+        <w:t>Exercise 7.5: Angle Sum Property of a Triangle (Page 130)</w:t>
+      </w:r>
+    </w:p>
+    <w:p>
+      <w:pPr>
+        <w:spacing w:after="80"/>
+      </w:pPr>
+      <w:r>
+        <w:t>1. Take three non-collinear points $A, B,$ and $C$ on a page of your notebook. Join $AB, BC,$ and $CA$. What figure do you get? Name: `[2]`</w:t>
+      </w:r>
+    </w:p>
+    <w:p>
+      <w:pPr>
+        <w:spacing w:after="80"/>
+      </w:pPr>
+      <w:r>
+        <w:t>(a) The side opposite to $\angle B$</w:t>
+      </w:r>
+    </w:p>
+    <w:p>
+      <w:pPr>
+        <w:spacing w:after="80"/>
+      </w:pPr>
+      <w:r>
+        <w:t>(b) The angle opposite to side $AB$</w:t>
+      </w:r>
+    </w:p>
+    <w:p>
+      <w:pPr>
+        <w:spacing w:after="80"/>
+      </w:pPr>
+      <w:r>
+        <w:t>(c) The vertex opposite to side $BC$</w:t>
+      </w:r>
+    </w:p>
+    <w:p>
+      <w:pPr>
+        <w:spacing w:after="80"/>
+      </w:pPr>
+      <w:r>
+        <w:t>(d) The side opposite to vertex $B$</w:t>
+      </w:r>
+    </w:p>
+    <w:p>
+      <w:pPr>
+        <w:spacing w:after="80"/>
+      </w:pPr>
+      <w:r>
+        <w:t>2. The three angles of a triangle are equal to one another. What is the measure of each angle? What kind of triangle is it? `[2]`</w:t>
+      </w:r>
+    </w:p>
+    <w:p>
+      <w:pPr>
+        <w:spacing w:after="80"/>
+      </w:pPr>
+      <w:r>
+        <w:t>3. Find the third angle of a triangle when two of the angles are: `[2]`</w:t>
+      </w:r>
+    </w:p>
+    <w:p>
+      <w:pPr>
+        <w:spacing w:after="80"/>
+      </w:pPr>
+      <w:r>
+        <w:t>(a) $36^\circ$ and $72^\circ$</w:t>
+      </w:r>
+    </w:p>
+    <w:p>
+      <w:pPr>
+        <w:spacing w:after="80"/>
+      </w:pPr>
+      <w:r>
+        <w:t>(b) $150^\circ$ and $15^\circ$</w:t>
+      </w:r>
+    </w:p>
+    <w:p>
+      <w:pPr>
+        <w:spacing w:after="80"/>
+      </w:pPr>
+      <w:r>
+        <w:t>(c) $90^\circ$ and $30^\circ$</w:t>
+      </w:r>
+    </w:p>
+    <w:p>
+      <w:pPr>
+        <w:spacing w:after="80"/>
+      </w:pPr>
+      <w:r>
+        <w:t>(d) $75^\circ$ and $45^\circ$</w:t>
+      </w:r>
+    </w:p>
+    <w:p>
+      <w:pPr>
+        <w:spacing w:after="80"/>
+      </w:pPr>
+      <w:r>
+        <w:t>4. The angles of a triangle are in the ratio $1 : 2 : 3$. Determine the measures of all three angles. `[2]`</w:t>
+      </w:r>
+    </w:p>
+    <w:p>
+      <w:pPr>
+        <w:spacing w:after="80"/>
+      </w:pPr>
+      <w:r>
+        <w:t>5. In a triangle, if two angles are $50^\circ$ and $70^\circ$, find the measure of the third angle $x$. `[2]`</w:t>
+      </w:r>
+    </w:p>
+    <w:p>
+      <w:pPr>
+        <w:spacing w:after="80"/>
+      </w:pPr>
+      <w:r>
+        <w:t>6. The angles of a triangle are arranged in ascending order such that the difference between consecutive angles is $10^\circ$. Find the three angles. `[3]`</w:t>
+      </w:r>
+    </w:p>
+    <w:p>
+      <w:pPr>
+        <w:spacing w:after="80"/>
+      </w:pPr>
+      <w:r>
+        <w:t>7. If one angle of a triangle is $60^\circ$ and the other two angles are in the ratio $1 : 5$, find the angles. `[3]`</w:t>
+      </w:r>
+    </w:p>
+    <w:p>
+      <w:pPr>
+        <w:spacing w:after="80"/>
+      </w:pPr>
+      <w:r>
+        <w:t>8. Two angles of a triangle are equal and the third angle measures $30^\circ$. Determine all the angles of the triangle. `[2]`</w:t>
+      </w:r>
+    </w:p>
+    <w:p>
+      <w:pPr>
+        <w:spacing w:after="80"/>
+      </w:pPr>
+      <w:r>
+        <w:t>9. If one angle of a triangle is equal to the sum of the other two angles, prove that the triangle is a right triangle. `[3]`</w:t>
+      </w:r>
+    </w:p>
+    <w:p>
+      <w:pPr>
+        <w:spacing w:after="80"/>
+      </w:pPr>
+      <w:r>
+        <w:t>10. The two acute angles of a right triangle differ by $20^\circ$. Find the two angles. `[3]`</w:t>
+      </w:r>
+    </w:p>
+    <w:p>
+      <w:pPr>
+        <w:spacing w:after="80"/>
+      </w:pPr>
+      <w:r>
+        <w:t>11. In $\triangle PQR$, $\angle P = (2x)^\circ, \angle Q = (3x)^\circ,$ and $\angle R = (5x)^\circ$. Find the value of $x$ and all angles. `[3]`</w:t>
+      </w:r>
+    </w:p>
+    <w:p>
+      <w:pPr>
+        <w:spacing w:after="80"/>
+      </w:pPr>
+      <w:r>
+        <w:t>12. What happens to the area and the figure when three vertices of a triangle lie on a single straight line? `[1]`</w:t>
+      </w:r>
+    </w:p>
+    <w:p>
+      <w:r>
+        <w:rPr>
+          <w:color w:val="CBD5E1"/>
+        </w:rPr>
+        <w:t>____________________________________________________</w:t>
+      </w:r>
+    </w:p>
+    <w:p>
+      <w:pPr>
+        <w:pStyle w:val="Heading2"/>
+      </w:pPr>
+      <w:r>
+        <w:rPr>
+          <w:color w:val="0F172A"/>
+          <w:sz w:val="26"/>
+        </w:rPr>
+        <w:t>Exercise 7.6: Exterior Angle Property &amp; Altitudes (Pages 131–133)</w:t>
+      </w:r>
+    </w:p>
+    <w:p>
+      <w:pPr>
+        <w:spacing w:after="80"/>
+      </w:pPr>
+      <w:r>
+        <w:t>1. In the given figure, $\angle x : \angle y = 5 : 3$ and the exterior angle $\angle ACD = 160^\circ$. Find the values of $x, y,$ and $z$ (where $z = \angle ACB$). `[3]`</w:t>
+      </w:r>
+    </w:p>
+    <w:p>
+      <w:pPr>
+        <w:spacing w:after="80"/>
+      </w:pPr>
+      <w:r>
+        <w:t>2. Compute the value of $x$ in each of the following cases: `[3]`</w:t>
+      </w:r>
+    </w:p>
+    <w:p>
+      <w:pPr>
+        <w:spacing w:after="80"/>
+      </w:pPr>
+      <w:r>
+        <w:t>(a) Exterior angle is $110^\circ$, one interior opposite angle is $50^\circ$.</w:t>
+      </w:r>
+    </w:p>
+    <w:p>
+      <w:pPr>
+        <w:spacing w:after="80"/>
+      </w:pPr>
+      <w:r>
+        <w:t>(b) Exterior angle is $125^\circ$, one interior opposite angle is $65^\circ$.</w:t>
+      </w:r>
+    </w:p>
+    <w:p>
+      <w:pPr>
+        <w:spacing w:after="80"/>
+      </w:pPr>
+      <w:r>
+        <w:t>(c) Interior opposite angles are $40^\circ$ and $70^\circ$, exterior angle is $x$.</w:t>
+      </w:r>
+    </w:p>
+    <w:p>
+      <w:pPr>
+        <w:spacing w:after="80"/>
+      </w:pPr>
+      <w:r>
+        <w:t>3. An exterior angle of a triangle is $115^\circ$ and one of the interior opposite angles is $35^\circ$. Find the other interior opposite angle. `[2]`</w:t>
+      </w:r>
+    </w:p>
+    <w:p>
+      <w:pPr>
+        <w:spacing w:after="80"/>
+      </w:pPr>
+      <w:r>
+        <w:t>4. One of the exterior angles of a triangle is $120^\circ$ and the interior opposite angles are in the ratio $1 : 2$. Find all the angles of the triangle. `[3]`</w:t>
+      </w:r>
+    </w:p>
+    <w:p>
+      <w:pPr>
+        <w:spacing w:after="80"/>
+      </w:pPr>
+      <w:r>
+        <w:t>5. In $\triangle ABC$, side $BC$ is produced to $D$. If $\angle ACD = 105^\circ$ and $\angle BAC = 45^\circ$, find $\angle ABC$ and $\angle ACB$. `[3]`</w:t>
+      </w:r>
+    </w:p>
+    <w:p>
+      <w:pPr>
+        <w:spacing w:after="80"/>
+      </w:pPr>
+      <w:r>
+        <w:t>6. In $\triangle ABC$, $AC \perp BD$, and the angles are in ratio $\angle A : \angle B : \angle C = 3 : 2 : 1$. Find the angles. `[3]`</w:t>
+      </w:r>
+    </w:p>
+    <w:p>
+      <w:pPr>
+        <w:spacing w:after="80"/>
+      </w:pPr>
+      <w:r>
+        <w:t>7. Describe the location of the orthocenter in: `[2]`</w:t>
+      </w:r>
+    </w:p>
+    <w:p>
+      <w:pPr>
+        <w:spacing w:after="80"/>
+      </w:pPr>
+      <w:r>
+        <w:t>(a) An acute-angled triangle</w:t>
+      </w:r>
+    </w:p>
+    <w:p>
+      <w:pPr>
+        <w:spacing w:after="80"/>
+      </w:pPr>
+      <w:r>
+        <w:t>(b) A right-angled triangle</w:t>
+      </w:r>
+    </w:p>
+    <w:p>
+      <w:pPr>
+        <w:spacing w:after="80"/>
+      </w:pPr>
+      <w:r>
+        <w:t>(c) An obtuse-angled triangle</w:t>
+      </w:r>
+    </w:p>
+    <w:p>
+      <w:pPr>
+        <w:spacing w:after="80"/>
+      </w:pPr>
+      <w:r>
+        <w:t>8. $\triangle ABC$ is an isosceles triangle with $AB = AC$. Ray $AX$ bisects the exterior angle $\angle DAC$. If $\angle B = 70^\circ$, find $\angle ACB$ and prove that $AX \parallel BC$. `[4]`</w:t>
+      </w:r>
+    </w:p>
+    <w:p>
+      <w:r>
+        <w:rPr>
+          <w:color w:val="CBD5E1"/>
+        </w:rPr>
+        <w:t>____________________________________________________</w:t>
+      </w:r>
+    </w:p>
+    <w:p>
+      <w:pPr>
+        <w:pStyle w:val="Heading2"/>
+      </w:pPr>
+      <w:r>
+        <w:rPr>
+          <w:color w:val="0F172A"/>
+          <w:sz w:val="26"/>
+        </w:rPr>
+        <w:t>Chapter 7 Drill (Pages 135–138)</w:t>
       </w:r>
     </w:p>
     <w:p>
@@ -63,15 +1173,707 @@
           <w:color w:val="0369A1"/>
           <w:sz w:val="22"/>
         </w:rPr>
-        <w:t>CHAPTER ASSESSMENT TEST PAPER</w:t>
-      </w:r>
-    </w:p>
-    <w:p>
-      <w:pPr>
-        <w:spacing w:after="80"/>
-      </w:pPr>
-      <w:r>
-        <w:t>**Time Allowed:** 1 Hour | **Maximum Marks:** 40 Marks</w:t>
+        <w:t>Section A: Multiple Choice Questions (1 Mark each)</w:t>
+      </w:r>
+    </w:p>
+    <w:p>
+      <w:pPr>
+        <w:spacing w:after="80"/>
+      </w:pPr>
+      <w:r>
+        <w:t>1. In triangle construction, if the sum of two sides is exactly equal to the third side, the arcs drawn will:</w:t>
+      </w:r>
+    </w:p>
+    <w:p>
+      <w:pPr>
+        <w:spacing w:after="80"/>
+      </w:pPr>
+      <w:r>
+        <w:t>(a) Touch at one point</w:t>
+      </w:r>
+    </w:p>
+    <w:p>
+      <w:pPr>
+        <w:spacing w:after="80"/>
+      </w:pPr>
+      <w:r>
+        <w:t>(b) Intersect at two points</w:t>
+      </w:r>
+    </w:p>
+    <w:p>
+      <w:pPr>
+        <w:spacing w:after="80"/>
+      </w:pPr>
+      <w:r>
+        <w:t>(c) Intersect internally</w:t>
+      </w:r>
+    </w:p>
+    <w:p>
+      <w:pPr>
+        <w:spacing w:after="80"/>
+      </w:pPr>
+      <w:r>
+        <w:t>(d) Not meet at all</w:t>
+      </w:r>
+    </w:p>
+    <w:p>
+      <w:pPr>
+        <w:spacing w:after="80"/>
+      </w:pPr>
+      <w:r>
+        <w:t>2. Which set of lengths forms a valid triangle?</w:t>
+      </w:r>
+    </w:p>
+    <w:p>
+      <w:pPr>
+        <w:spacing w:after="80"/>
+      </w:pPr>
+      <w:r>
+        <w:t>(a) $2, 3, 6$</w:t>
+      </w:r>
+    </w:p>
+    <w:p>
+      <w:pPr>
+        <w:spacing w:after="80"/>
+      </w:pPr>
+      <w:r>
+        <w:t>(b) $4, 5, 9$</w:t>
+      </w:r>
+    </w:p>
+    <w:p>
+      <w:pPr>
+        <w:spacing w:after="80"/>
+      </w:pPr>
+      <w:r>
+        <w:t>(c) $3, 4, 5$</w:t>
+      </w:r>
+    </w:p>
+    <w:p>
+      <w:pPr>
+        <w:spacing w:after="80"/>
+      </w:pPr>
+      <w:r>
+        <w:t>(d) $1, 2, 4$</w:t>
+      </w:r>
+    </w:p>
+    <w:p>
+      <w:pPr>
+        <w:spacing w:after="80"/>
+      </w:pPr>
+      <w:r>
+        <w:t>3. The altitude of a right-angled triangle drawn from the right angle vertex:</w:t>
+      </w:r>
+    </w:p>
+    <w:p>
+      <w:pPr>
+        <w:spacing w:after="80"/>
+      </w:pPr>
+      <w:r>
+        <w:t>(a) Lies outside</w:t>
+      </w:r>
+    </w:p>
+    <w:p>
+      <w:pPr>
+        <w:spacing w:after="80"/>
+      </w:pPr>
+      <w:r>
+        <w:t>(b) Coincides with hypotenuse</w:t>
+      </w:r>
+    </w:p>
+    <w:p>
+      <w:pPr>
+        <w:spacing w:after="80"/>
+      </w:pPr>
+      <w:r>
+        <w:t>(c) Lies inside the triangle</w:t>
+      </w:r>
+    </w:p>
+    <w:p>
+      <w:pPr>
+        <w:spacing w:after="80"/>
+      </w:pPr>
+      <w:r>
+        <w:t>(d) Is not possible</w:t>
+      </w:r>
+    </w:p>
+    <w:p>
+      <w:pPr>
+        <w:spacing w:after="80"/>
+      </w:pPr>
+      <w:r>
+        <w:t>4. If two sides of a triangle are $5\text{ cm}$ and $6\text{ cm}$, which of the following CANNOT be the third side?</w:t>
+      </w:r>
+    </w:p>
+    <w:p>
+      <w:pPr>
+        <w:spacing w:after="80"/>
+      </w:pPr>
+      <w:r>
+        <w:t>(a) $12\text{ cm}$</w:t>
+      </w:r>
+    </w:p>
+    <w:p>
+      <w:pPr>
+        <w:spacing w:after="80"/>
+      </w:pPr>
+      <w:r>
+        <w:t>(b) $4\text{ cm}$</w:t>
+      </w:r>
+    </w:p>
+    <w:p>
+      <w:pPr>
+        <w:spacing w:after="80"/>
+      </w:pPr>
+      <w:r>
+        <w:t>(c) $8\text{ cm}$</w:t>
+      </w:r>
+    </w:p>
+    <w:p>
+      <w:pPr>
+        <w:spacing w:after="80"/>
+      </w:pPr>
+      <w:r>
+        <w:t>(d) $2\text{ cm}$</w:t>
+      </w:r>
+    </w:p>
+    <w:p>
+      <w:pPr>
+        <w:spacing w:after="80"/>
+      </w:pPr>
+      <w:r>
+        <w:t>5. In a right-angled triangle, the longest side is called the:</w:t>
+      </w:r>
+    </w:p>
+    <w:p>
+      <w:pPr>
+        <w:spacing w:after="80"/>
+      </w:pPr>
+      <w:r>
+        <w:t>(a) Median</w:t>
+      </w:r>
+    </w:p>
+    <w:p>
+      <w:pPr>
+        <w:spacing w:after="80"/>
+      </w:pPr>
+      <w:r>
+        <w:t>(b) Hypotenuse</w:t>
+      </w:r>
+    </w:p>
+    <w:p>
+      <w:pPr>
+        <w:spacing w:after="80"/>
+      </w:pPr>
+      <w:r>
+        <w:t>(c) Altitude</w:t>
+      </w:r>
+    </w:p>
+    <w:p>
+      <w:pPr>
+        <w:spacing w:after="80"/>
+      </w:pPr>
+      <w:r>
+        <w:t>(d) Base</w:t>
+      </w:r>
+    </w:p>
+    <w:p>
+      <w:pPr>
+        <w:spacing w:after="80"/>
+      </w:pPr>
+      <w:r>
+        <w:t>6. The point where the three medians of a triangle meet is the:</w:t>
+      </w:r>
+    </w:p>
+    <w:p>
+      <w:pPr>
+        <w:spacing w:after="80"/>
+      </w:pPr>
+      <w:r>
+        <w:t>(a) Midpoint</w:t>
+      </w:r>
+    </w:p>
+    <w:p>
+      <w:pPr>
+        <w:spacing w:after="80"/>
+      </w:pPr>
+      <w:r>
+        <w:t>(b) Vertex</w:t>
+      </w:r>
+    </w:p>
+    <w:p>
+      <w:pPr>
+        <w:spacing w:after="80"/>
+      </w:pPr>
+      <w:r>
+        <w:t>(c) Centroid</w:t>
+      </w:r>
+    </w:p>
+    <w:p>
+      <w:pPr>
+        <w:spacing w:after="80"/>
+      </w:pPr>
+      <w:r>
+        <w:t>(d) Orthocenter</w:t>
+      </w:r>
+    </w:p>
+    <w:p>
+      <w:pPr>
+        <w:spacing w:after="80"/>
+      </w:pPr>
+      <w:r>
+        <w:t>7. An altitude is always:</w:t>
+      </w:r>
+    </w:p>
+    <w:p>
+      <w:pPr>
+        <w:spacing w:after="80"/>
+      </w:pPr>
+      <w:r>
+        <w:t>(a) Parallel to base</w:t>
+      </w:r>
+    </w:p>
+    <w:p>
+      <w:pPr>
+        <w:spacing w:after="80"/>
+      </w:pPr>
+      <w:r>
+        <w:t>(b) Perpendicular to base</w:t>
+      </w:r>
+    </w:p>
+    <w:p>
+      <w:pPr>
+        <w:spacing w:after="80"/>
+      </w:pPr>
+      <w:r>
+        <w:t>(c) Equal to base</w:t>
+      </w:r>
+    </w:p>
+    <w:p>
+      <w:pPr>
+        <w:spacing w:after="80"/>
+      </w:pPr>
+      <w:r>
+        <w:t>(d) Curved</w:t>
+      </w:r>
+    </w:p>
+    <w:p>
+      <w:pPr>
+        <w:spacing w:after="80"/>
+      </w:pPr>
+      <w:r>
+        <w:t>8. A triangle cannot exist if:</w:t>
+      </w:r>
+    </w:p>
+    <w:p>
+      <w:pPr>
+        <w:spacing w:after="80"/>
+      </w:pPr>
+      <w:r>
+        <w:t>(a) One side = sum of other two</w:t>
+      </w:r>
+    </w:p>
+    <w:p>
+      <w:pPr>
+        <w:spacing w:after="80"/>
+      </w:pPr>
+      <w:r>
+        <w:t>(b) All sides equal</w:t>
+      </w:r>
+    </w:p>
+    <w:p>
+      <w:pPr>
+        <w:spacing w:after="80"/>
+      </w:pPr>
+      <w:r>
+        <w:t>(c) All angles acute</w:t>
+      </w:r>
+    </w:p>
+    <w:p>
+      <w:pPr>
+        <w:spacing w:after="80"/>
+      </w:pPr>
+      <w:r>
+        <w:t>(d) One angle is right</w:t>
+      </w:r>
+    </w:p>
+    <w:p>
+      <w:pPr>
+        <w:spacing w:after="80"/>
+      </w:pPr>
+      <w:r>
+        <w:t>9. To construct a unique triangle using the SAS criterion, the angle must be:</w:t>
+      </w:r>
+    </w:p>
+    <w:p>
+      <w:pPr>
+        <w:spacing w:after="80"/>
+      </w:pPr>
+      <w:r>
+        <w:t>(a) Acute</w:t>
+      </w:r>
+    </w:p>
+    <w:p>
+      <w:pPr>
+        <w:spacing w:after="80"/>
+      </w:pPr>
+      <w:r>
+        <w:t>(b) Right angle</w:t>
+      </w:r>
+    </w:p>
+    <w:p>
+      <w:pPr>
+        <w:spacing w:after="80"/>
+      </w:pPr>
+      <w:r>
+        <w:t>(c) Included between the given sides</w:t>
+      </w:r>
+    </w:p>
+    <w:p>
+      <w:pPr>
+        <w:spacing w:after="80"/>
+      </w:pPr>
+      <w:r>
+        <w:t>(d) Any angle</w:t>
+      </w:r>
+    </w:p>
+    <w:p>
+      <w:pPr>
+        <w:spacing w:after="80"/>
+      </w:pPr>
+      <w:r>
+        <w:t>10. If an exterior angle of a triangle measures $110^\circ$ and one of its interior opposite angles is $50^\circ$, what is the measure of the other interior opposite angle?</w:t>
+      </w:r>
+    </w:p>
+    <w:p>
+      <w:pPr>
+        <w:spacing w:after="80"/>
+      </w:pPr>
+      <w:r>
+        <w:t>(a) $50^\circ$</w:t>
+      </w:r>
+    </w:p>
+    <w:p>
+      <w:pPr>
+        <w:spacing w:after="80"/>
+      </w:pPr>
+      <w:r>
+        <w:t>(b) $60^\circ$</w:t>
+      </w:r>
+    </w:p>
+    <w:p>
+      <w:pPr>
+        <w:spacing w:after="80"/>
+      </w:pPr>
+      <w:r>
+        <w:t>(c) $70^\circ$</w:t>
+      </w:r>
+    </w:p>
+    <w:p>
+      <w:pPr>
+        <w:spacing w:after="80"/>
+      </w:pPr>
+      <w:r>
+        <w:t>(d) $180^\circ$</w:t>
+      </w:r>
+    </w:p>
+    <w:p>
+      <w:pPr>
+        <w:pStyle w:val="Heading3"/>
+      </w:pPr>
+      <w:r>
+        <w:rPr>
+          <w:color w:val="0369A1"/>
+          <w:sz w:val="22"/>
+        </w:rPr>
+        <w:t>Section B: Fill in the Blanks (1 Mark each)</w:t>
+      </w:r>
+    </w:p>
+    <w:p>
+      <w:pPr>
+        <w:spacing w:after="80"/>
+      </w:pPr>
+      <w:r>
+        <w:t>1. A triangle is formed by joining three $\underline{\hspace{3cm}}$ points.</w:t>
+      </w:r>
+    </w:p>
+    <w:p>
+      <w:pPr>
+        <w:spacing w:after="80"/>
+      </w:pPr>
+      <w:r>
+        <w:t>2. A perpendicular drawn from a vertex to the opposite side is called an $\underline{\hspace{3cm}}$.</w:t>
+      </w:r>
+    </w:p>
+    <w:p>
+      <w:pPr>
+        <w:spacing w:after="80"/>
+      </w:pPr>
+      <w:r>
+        <w:t>3. A triangle in which one angle is $90^\circ$ is called a $\underline{\hspace{3cm}}$ triangle.</w:t>
+      </w:r>
+    </w:p>
+    <w:p>
+      <w:pPr>
+        <w:spacing w:after="80"/>
+      </w:pPr>
+      <w:r>
+        <w:t>4. In an $\underline{\hspace{3cm}}$ triangle, at least two sides are equal.</w:t>
+      </w:r>
+    </w:p>
+    <w:p>
+      <w:pPr>
+        <w:spacing w:after="80"/>
+      </w:pPr>
+      <w:r>
+        <w:t>5. Triangle inequality states that each side must be $\underline{\hspace{3cm}}$ than the sum of the other two sides.</w:t>
+      </w:r>
+    </w:p>
+    <w:p>
+      <w:pPr>
+        <w:spacing w:after="80"/>
+      </w:pPr>
+      <w:r>
+        <w:t>6. The intersection point of altitudes is called the $\underline{\hspace{3cm}}$.</w:t>
+      </w:r>
+    </w:p>
+    <w:p>
+      <w:pPr>
+        <w:pStyle w:val="Heading3"/>
+      </w:pPr>
+      <w:r>
+        <w:rPr>
+          <w:color w:val="0369A1"/>
+          <w:sz w:val="22"/>
+        </w:rPr>
+        <w:t>Section C: Very Short Answer Questions (1 Mark each)</w:t>
+      </w:r>
+    </w:p>
+    <w:p>
+      <w:pPr>
+        <w:spacing w:after="80"/>
+      </w:pPr>
+      <w:r>
+        <w:t>1. Can a triangle have angles measuring $100^\circ, 50^\circ,$ and $40^\circ$? Justify. `[1]`</w:t>
+      </w:r>
+    </w:p>
+    <w:p>
+      <w:pPr>
+        <w:spacing w:after="80"/>
+      </w:pPr>
+      <w:r>
+        <w:t>2. Define the median of a triangle. `[1]`</w:t>
+      </w:r>
+    </w:p>
+    <w:p>
+      <w:pPr>
+        <w:spacing w:after="80"/>
+      </w:pPr>
+      <w:r>
+        <w:t>3. What is the measure of each angle of an equilateral triangle? `[1]`</w:t>
+      </w:r>
+    </w:p>
+    <w:p>
+      <w:pPr>
+        <w:spacing w:after="80"/>
+      </w:pPr>
+      <w:r>
+        <w:t>4. Does an equilateral triangle with sides $50\text{ cm}, 50\text{ cm}, 50\text{ cm}$ exist? In general, does an equilateral triangle exist for any given side length? `[1]`</w:t>
+      </w:r>
+    </w:p>
+    <w:p>
+      <w:pPr>
+        <w:spacing w:after="80"/>
+      </w:pPr>
+      <w:r>
+        <w:t>5. Which side is the longest side in a right-angled triangle? `[1]`</w:t>
+      </w:r>
+    </w:p>
+    <w:p>
+      <w:pPr>
+        <w:spacing w:after="80"/>
+      </w:pPr>
+      <w:r>
+        <w:t>6. If the sides of a triangle are $2\text{ cm}, 3\text{ cm},$ and $5\text{ cm}$, is it possible to form a triangle? `[1]`</w:t>
+      </w:r>
+    </w:p>
+    <w:p>
+      <w:pPr>
+        <w:spacing w:after="80"/>
+      </w:pPr>
+      <w:r>
+        <w:t>7. How many vertices does a triangle have? `[1]`</w:t>
+      </w:r>
+    </w:p>
+    <w:p>
+      <w:pPr>
+        <w:spacing w:after="80"/>
+      </w:pPr>
+      <w:r>
+        <w:t>8. Find the third angle of a triangle if the other two angles are $58^\circ$ and $62^\circ$. `[1]`</w:t>
+      </w:r>
+    </w:p>
+    <w:p>
+      <w:pPr>
+        <w:spacing w:after="80"/>
+      </w:pPr>
+      <w:r>
+        <w:t>9. Find the exterior angle of a triangle if the interior opposite angles are $46^\circ$ and $54^\circ$. `[1]`</w:t>
+      </w:r>
+    </w:p>
+    <w:p>
+      <w:pPr>
+        <w:pStyle w:val="Heading3"/>
+      </w:pPr>
+      <w:r>
+        <w:rPr>
+          <w:color w:val="0369A1"/>
+          <w:sz w:val="22"/>
+        </w:rPr>
+        <w:t>Section D: Short Answer Questions (2 Marks each)</w:t>
+      </w:r>
+    </w:p>
+    <w:p>
+      <w:pPr>
+        <w:spacing w:after="80"/>
+      </w:pPr>
+      <w:r>
+        <w:t>1. Two angles of a triangle measure $45^\circ$ and $65^\circ$. Find the measure of the third angle. `[2]`</w:t>
+      </w:r>
+    </w:p>
+    <w:p>
+      <w:pPr>
+        <w:spacing w:after="80"/>
+      </w:pPr>
+      <w:r>
+        <w:t>2. The angles of a triangle are $(x - 40)^\circ, (x - 20)^\circ,$ and $\left(\frac{1}{2}x - 10\right)^\circ$. Find the value of $x$. `[2]`</w:t>
+      </w:r>
+    </w:p>
+    <w:p>
+      <w:pPr>
+        <w:spacing w:after="80"/>
+      </w:pPr>
+      <w:r>
+        <w:t>3. An isosceles triangle has a vertex angle of $50^\circ$. Find the measures of its base angles. `[2]`</w:t>
+      </w:r>
+    </w:p>
+    <w:p>
+      <w:pPr>
+        <w:spacing w:after="80"/>
+      </w:pPr>
+      <w:r>
+        <w:t>4. Why can a triangle not have two right angles? `[2]`</w:t>
+      </w:r>
+    </w:p>
+    <w:p>
+      <w:pPr>
+        <w:spacing w:after="80"/>
+      </w:pPr>
+      <w:r>
+        <w:t>5. If the perimeter of an equilateral triangle is $36\text{ cm}$, find the length of each side. `[2]`</w:t>
+      </w:r>
+    </w:p>
+    <w:p>
+      <w:pPr>
+        <w:spacing w:after="80"/>
+      </w:pPr>
+      <w:r>
+        <w:t>6. In a triangle, an exterior angle measures $130^\circ$ and one interior opposite angle is $70^\circ$. Find the other interior opposite angle. `[2]`</w:t>
+      </w:r>
+    </w:p>
+    <w:p>
+      <w:pPr>
+        <w:pStyle w:val="Heading3"/>
+      </w:pPr>
+      <w:r>
+        <w:rPr>
+          <w:color w:val="0369A1"/>
+          <w:sz w:val="22"/>
+        </w:rPr>
+        <w:t>Section E: Long Answer Questions (4 Marks each)</w:t>
+      </w:r>
+    </w:p>
+    <w:p>
+      <w:pPr>
+        <w:spacing w:after="80"/>
+      </w:pPr>
+      <w:r>
+        <w:t>1. State and prove the **Angle Sum Property of a Triangle** using a parallel auxiliary line. `[4]`</w:t>
+      </w:r>
+    </w:p>
+    <w:p>
+      <w:pPr>
+        <w:spacing w:after="80"/>
+      </w:pPr>
+      <w:r>
+        <w:t>2. In $\triangle ABC$, $\angle B = 2\angle A$ and $\angle C = 3\angle A$. Find all three angles and classify the triangle. `[4]`</w:t>
+      </w:r>
+    </w:p>
+    <w:p>
+      <w:pPr>
+        <w:spacing w:after="80"/>
+      </w:pPr>
+      <w:r>
+        <w:t>3. Construct $\triangle ABC$ where side $AB = 6\text{ cm}, \angle A = 60^\circ,$ and $\angle B = 45^\circ$ using a ruler and compass. Calculate the measure of the third angle $\angle C$. `[4]`</w:t>
+      </w:r>
+    </w:p>
+    <w:p>
+      <w:pPr>
+        <w:spacing w:after="80"/>
+      </w:pPr>
+      <w:r>
+        <w:t>4. An exterior angle of a triangle is $120^\circ$ and one of the interior opposite angles is $40^\circ$. Find all the interior angles of the triangle. `[4]`</w:t>
+      </w:r>
+    </w:p>
+    <w:p>
+      <w:pPr>
+        <w:spacing w:after="80"/>
+      </w:pPr>
+      <w:r>
+        <w:t>5. In $\triangle DEF$, the lengths of sides are $DE = 4.5\text{ cm}, EF = 5.5\text{ cm},$ and $DF = 10\text{ cm}$. Can this triangle be constructed? Justify using the triangle inequality theorem. `[4]`</w:t>
+      </w:r>
+    </w:p>
+    <w:p>
+      <w:pPr>
+        <w:spacing w:after="80"/>
+      </w:pPr>
+      <w:r>
+        <w:t>6. In $\triangle ABC$, $AD \perp BC$ and $BE \perp AC$. If $\angle BAC = 50^\circ$ and $\angle ABC = 70^\circ$, find $\angle BCA$, $\angle CAD$, and $\angle CBE$. `[4]`</w:t>
+      </w:r>
+    </w:p>
+    <w:p>
+      <w:pPr>
+        <w:pStyle w:val="Heading3"/>
+      </w:pPr>
+      <w:r>
+        <w:rPr>
+          <w:color w:val="0369A1"/>
+          <w:sz w:val="22"/>
+        </w:rPr>
+        <w:t>Section F: Competency-Based HOTS &amp; Life Skills (Page 138)</w:t>
+      </w:r>
+    </w:p>
+    <w:p>
+      <w:pPr>
+        <w:spacing w:after="80"/>
+      </w:pPr>
+      <w:r>
+        <w:t>1. Three sticks measure $10\text{ cm}, 14\text{ cm},$ and $25\text{ cm}$. If the longest stick is broken into two pieces of $12\text{ cm}$ and $13\text{ cm}$, determine if a triangle can be formed with the original two sticks and one of the broken pieces. `[3]`</w:t>
+      </w:r>
+    </w:p>
+    <w:p>
+      <w:pPr>
+        <w:spacing w:after="80"/>
+      </w:pPr>
+      <w:r>
+        <w:t>2. If the sides of a triangle are $(x + 1), (x + 2),$ and $5$, find the complete mathematical range of possible values for $x$. `[3]`</w:t>
+      </w:r>
+    </w:p>
+    <w:p>
+      <w:pPr>
+        <w:spacing w:after="80"/>
+      </w:pPr>
+      <w:r>
+        <w:t>3. Explain how the structural rigidity of triangles in engineering bridges and roof trusses reflects the importance of core moral values in personal character. `[2]`</w:t>
       </w:r>
     </w:p>
     <w:p>
@@ -80,6 +1882,1914 @@
           <w:color w:val="CBD5E1"/>
         </w:rPr>
         <w:t>____________________________________________________</w:t>
+      </w:r>
+    </w:p>
+    <w:p>
+      <w:r>
+        <w:rPr>
+          <w:color w:val="CBD5E1"/>
+        </w:rPr>
+        <w:t>____________________________________________________</w:t>
+      </w:r>
+    </w:p>
+    <w:p>
+      <w:pPr>
+        <w:pStyle w:val="Heading1"/>
+      </w:pPr>
+      <w:r>
+        <w:rPr>
+          <w:color w:val="0369A1"/>
+          <w:sz w:val="36"/>
+        </w:rPr>
+        <w:t>PART II: CHAPTER 8 — WORKING WITH FRACTIONS</w:t>
+      </w:r>
+    </w:p>
+    <w:p>
+      <w:pPr>
+        <w:pStyle w:val="Heading2"/>
+      </w:pPr>
+      <w:r>
+        <w:rPr>
+          <w:color w:val="0F172A"/>
+          <w:sz w:val="26"/>
+        </w:rPr>
+        <w:t>🏛️ Visual Foundations &amp; Diagrammatic Analysis</w:t>
+      </w:r>
+    </w:p>
+    <w:p>
+      <w:pPr>
+        <w:spacing w:after="80"/>
+      </w:pPr>
+      <w:r>
+        <w:t>**Figure 8.1: 2D Area Dissection Model for Fraction Multiplication**</w:t>
+      </w:r>
+    </w:p>
+    <w:p>
+      <w:pPr>
+        <w:ind w:left="360"/>
+      </w:pPr>
+      <w:r>
+        <w:rPr>
+          <w:b/>
+          <w:i/>
+          <w:color w:val="0F766E"/>
+        </w:rPr>
+        <w:t>[2D Visual Diagram]: Figure 8.1: The 2D Area Dissection Model for Fraction Multiplication</w:t>
+      </w:r>
+    </w:p>
+    <w:p>
+      <w:pPr>
+        <w:spacing w:after="120"/>
+        <w:ind w:left="504"/>
+      </w:pPr>
+      <w:r>
+        <w:rPr>
+          <w:i/>
+          <w:color w:val="475569"/>
+          <w:sz w:val="19"/>
+        </w:rPr>
+        <w:t>3b1b Visual Intuition: Why is $\frac{1}{2} \times \frac{1}{3} = \frac{1}{6}$? Slice a $1 \times 1$ unit square vertically into 3 columns (each $\frac{1}{3}$ wide). Slice horizontally into 2 rows (each $\frac{1}{2}$ tall). The double-shaded rectangular cell where the top row overlaps the left column represents 'half of one-third'. The whole square now contains $2 \times 3 = 6$ identical small tiles, and exactly $1$ tile is selected!</w:t>
+      </w:r>
+    </w:p>
+    <w:p>
+      <w:pPr>
+        <w:spacing w:after="80"/>
+      </w:pPr>
+      <w:r>
+        <w:t>*Student Observation Task 1:* In the unit square model above, explain how shading $\frac{1}{3}$ of the width and $\frac{1}{2}$ of the height visually proves that $\frac{1}{2} \times \frac{1}{3} = \frac{1}{6}$. `[2]`</w:t>
+      </w:r>
+    </w:p>
+    <w:p>
+      <w:pPr>
+        <w:spacing w:after="80"/>
+      </w:pPr>
+      <w:r>
+        <w:t>$\underline{\hspace{14cm}}$</w:t>
+      </w:r>
+    </w:p>
+    <w:p>
+      <w:pPr>
+        <w:spacing w:after="80"/>
+      </w:pPr>
+      <w:r>
+        <w:t>**Figure 8.2: Measuring Scoop Division Model**</w:t>
+      </w:r>
+    </w:p>
+    <w:p>
+      <w:pPr>
+        <w:ind w:left="360"/>
+      </w:pPr>
+      <w:r>
+        <w:rPr>
+          <w:b/>
+          <w:i/>
+          <w:color w:val="0F766E"/>
+        </w:rPr>
+        <w:t>[2D Visual Diagram]: Figure 8.2: The Measuring Scoop Model for Fraction Division</w:t>
+      </w:r>
+    </w:p>
+    <w:p>
+      <w:pPr>
+        <w:spacing w:after="120"/>
+        <w:ind w:left="504"/>
+      </w:pPr>
+      <w:r>
+        <w:rPr>
+          <w:i/>
+          <w:color w:val="475569"/>
+          <w:sz w:val="19"/>
+        </w:rPr>
+        <w:t>3b1b Physical Intuition: Why do we 'flip and multiply' when dividing by $\frac{1}{2}$? Translate $3 \div \frac{1}{2}$ into reality: 'How many $\frac{1}{2}$-cup scoops of sugar fit in a 3-cup bag?' Every 1 whole cup holds 2 scoops (the reciprocal $1 \div \frac{1}{2} = 2$). Therefore, 3 whole cups must hold $3 \times 2 = 6$ scoops!</w:t>
+      </w:r>
+    </w:p>
+    <w:p>
+      <w:pPr>
+        <w:spacing w:after="80"/>
+      </w:pPr>
+      <w:r>
+        <w:t>*Student Observation Task 2:* State the physical question represented by $3 \div \frac{1}{2}$ using measuring scoops, and explain why division results in multiplying by the reciprocal $2$. `[2]`</w:t>
+      </w:r>
+    </w:p>
+    <w:p>
+      <w:pPr>
+        <w:spacing w:after="80"/>
+      </w:pPr>
+      <w:r>
+        <w:t>$\underline{\hspace{14cm}}$</w:t>
+      </w:r>
+    </w:p>
+    <w:p>
+      <w:pPr>
+        <w:spacing w:after="80"/>
+      </w:pPr>
+      <w:r>
+        <w:t>**Figure 8.3: Common Denominator Reslicing**</w:t>
+      </w:r>
+    </w:p>
+    <w:p>
+      <w:pPr>
+        <w:ind w:left="360"/>
+      </w:pPr>
+      <w:r>
+        <w:rPr>
+          <w:b/>
+          <w:i/>
+          <w:color w:val="0F766E"/>
+        </w:rPr>
+        <w:t>[2D Visual Diagram]: Figure 8.3: Reslicing for Common Denominators (LCM Standardization)</w:t>
+      </w:r>
+    </w:p>
+    <w:p>
+      <w:pPr>
+        <w:spacing w:after="120"/>
+        <w:ind w:left="504"/>
+      </w:pPr>
+      <w:r>
+        <w:rPr>
+          <w:i/>
+          <w:color w:val="475569"/>
+          <w:sz w:val="19"/>
+        </w:rPr>
+        <w:t>3b1b Intuition: You cannot add halves and thirds directly because their physical widths differ. Finding the common denominator $6$ (via LCM) is simply re-slicing both cakes so that all pieces share the exact same physical dimension ($\frac{1}{6}$), allowing direct addition: $\mathbf{\frac{3}{6} + \frac{2}{6} = \frac{5}{6}}$.</w:t>
+      </w:r>
+    </w:p>
+    <w:p>
+      <w:pPr>
+        <w:spacing w:after="80"/>
+      </w:pPr>
+      <w:r>
+        <w:t>*Student Observation Task 3:* Illustrate why $\frac{1}{2}$ and $\frac{1}{3}$ cannot be added directly without reslicing both rectangles into sixths ($\frac{1}{6}$). `[2]`</w:t>
+      </w:r>
+    </w:p>
+    <w:p>
+      <w:pPr>
+        <w:spacing w:after="80"/>
+      </w:pPr>
+      <w:r>
+        <w:t>$\underline{\hspace{14cm}}$</w:t>
+      </w:r>
+    </w:p>
+    <w:p>
+      <w:pPr>
+        <w:spacing w:after="80"/>
+      </w:pPr>
+      <w:r>
+        <w:t>**Figure 8.4: 3D Volumetric Fraction Voxel Slicer**</w:t>
+      </w:r>
+    </w:p>
+    <w:p>
+      <w:pPr>
+        <w:ind w:left="360"/>
+      </w:pPr>
+      <w:r>
+        <w:rPr>
+          <w:b/>
+          <w:i/>
+          <w:color w:val="0F766E"/>
+        </w:rPr>
+        <w:t>[2D Visual Diagram]: Figure 8.4: 3D Volumetric Fraction Voxel Slicer (Dissecting Unit Volume)</w:t>
+      </w:r>
+    </w:p>
+    <w:p>
+      <w:pPr>
+        <w:spacing w:after="120"/>
+        <w:ind w:left="504"/>
+      </w:pPr>
+      <w:r>
+        <w:rPr>
+          <w:i/>
+          <w:color w:val="475569"/>
+          <w:sz w:val="19"/>
+        </w:rPr>
+        <w:t>3b1b Spatial Intuition: Multiplication extends from numbers (1D lines) to area (2D tiles) to volume (3D space). Slicing a unit cube into 2 parts along width, 3 parts along height, and 2 parts along depth partitions 3D space into $2 \times 3 \times 2 = 12$ identical sub-cubes (voxels). Each voxel has dimensions $\frac{1}{2} \times \frac{1}{3} \times \frac{1}{2} = \mathbf{\frac{1}{12}}$ of the entire volume!</w:t>
+      </w:r>
+    </w:p>
+    <w:p>
+      <w:pPr>
+        <w:spacing w:after="80"/>
+      </w:pPr>
+      <w:r>
+        <w:t>*Student Observation Task 4 (3D Volumetric Fractions):* In the 3D unit cube model above, the cube is partitioned into 2 slices along width, 3 slices along height, and 2 slices along depth. Calculate the total number of voxel sub-cubes created, and express the volume of a single voxel as a fraction of the total unit cube volume. `[2]`</w:t>
+      </w:r>
+    </w:p>
+    <w:p>
+      <w:pPr>
+        <w:spacing w:after="80"/>
+      </w:pPr>
+      <w:r>
+        <w:t>$\underline{\hspace{14cm}}$</w:t>
+      </w:r>
+    </w:p>
+    <w:p>
+      <w:r>
+        <w:rPr>
+          <w:color w:val="CBD5E1"/>
+        </w:rPr>
+        <w:t>____________________________________________________</w:t>
+      </w:r>
+    </w:p>
+    <w:p>
+      <w:pPr>
+        <w:pStyle w:val="Heading2"/>
+      </w:pPr>
+      <w:r>
+        <w:rPr>
+          <w:color w:val="0F172A"/>
+          <w:sz w:val="26"/>
+        </w:rPr>
+        <w:t>Exercise 8.1: Taxonomy of Fractions &amp; Equivalent Fractions (Page 141)</w:t>
+      </w:r>
+    </w:p>
+    <w:p>
+      <w:pPr>
+        <w:spacing w:after="80"/>
+      </w:pPr>
+      <w:r>
+        <w:t>1. Classify each of the following as a proper fraction, improper fraction, or mixed fraction: `[2]`</w:t>
+      </w:r>
+    </w:p>
+    <w:p>
+      <w:pPr>
+        <w:spacing w:after="80"/>
+      </w:pPr>
+      <w:r>
+        <w:t>$$\frac{3}{5}, \quad \frac{7}{4}, \quad 2\frac{1}{3}, \quad \frac{1}{8}, \quad \frac{11}{11}, \quad \frac{15}{2}, \quad 4\frac{3}{7}, \quad \frac{9}{10}$$</w:t>
+      </w:r>
+    </w:p>
+    <w:p>
+      <w:pPr>
+        <w:spacing w:after="80"/>
+      </w:pPr>
+      <w:r>
+        <w:t>2. Convert the following mixed fractions into improper fractions: `[2]`</w:t>
+      </w:r>
+    </w:p>
+    <w:p>
+      <w:pPr>
+        <w:spacing w:after="80"/>
+      </w:pPr>
+      <w:r>
+        <w:t>(a) $2\frac{1}{3}$</w:t>
+      </w:r>
+    </w:p>
+    <w:p>
+      <w:pPr>
+        <w:spacing w:after="80"/>
+      </w:pPr>
+      <w:r>
+        <w:t>(b) $3\frac{2}{5}$</w:t>
+      </w:r>
+    </w:p>
+    <w:p>
+      <w:pPr>
+        <w:spacing w:after="80"/>
+      </w:pPr>
+      <w:r>
+        <w:t>(c) $7\frac{1}{2}$</w:t>
+      </w:r>
+    </w:p>
+    <w:p>
+      <w:pPr>
+        <w:spacing w:after="80"/>
+      </w:pPr>
+      <w:r>
+        <w:t>(d) $5\frac{3}{4}$</w:t>
+      </w:r>
+    </w:p>
+    <w:p>
+      <w:pPr>
+        <w:spacing w:after="80"/>
+      </w:pPr>
+      <w:r>
+        <w:t>(e) $2\frac{5}{8}$</w:t>
+      </w:r>
+    </w:p>
+    <w:p>
+      <w:pPr>
+        <w:spacing w:after="80"/>
+      </w:pPr>
+      <w:r>
+        <w:t>3. Find the missing numbers that make each set of fractions equal: `[2]`</w:t>
+      </w:r>
+    </w:p>
+    <w:p>
+      <w:pPr>
+        <w:spacing w:after="80"/>
+      </w:pPr>
+      <w:r>
+        <w:t>(a) $\frac{3}{5} = \frac{\Box}{20} = \frac{18}{\Box}$</w:t>
+      </w:r>
+    </w:p>
+    <w:p>
+      <w:pPr>
+        <w:spacing w:after="80"/>
+      </w:pPr>
+      <w:r>
+        <w:t>(b) $\frac{4}{7} = \frac{28}{\Box} = \frac{\Box}{49}$</w:t>
+      </w:r>
+    </w:p>
+    <w:p>
+      <w:pPr>
+        <w:spacing w:after="80"/>
+      </w:pPr>
+      <w:r>
+        <w:t>(c) $\frac{5}{8} = \frac{15}{\Box} = \frac{\Box}{64}$</w:t>
+      </w:r>
+    </w:p>
+    <w:p>
+      <w:pPr>
+        <w:spacing w:after="80"/>
+      </w:pPr>
+      <w:r>
+        <w:t>(d) $\frac{6}{11} = \frac{\Box}{33} = \frac{42}{\Box}$</w:t>
+      </w:r>
+    </w:p>
+    <w:p>
+      <w:pPr>
+        <w:spacing w:after="80"/>
+      </w:pPr>
+      <w:r>
+        <w:t>4. Write any three equivalent fractions for each of the following: `[2]`</w:t>
+      </w:r>
+    </w:p>
+    <w:p>
+      <w:pPr>
+        <w:spacing w:after="80"/>
+      </w:pPr>
+      <w:r>
+        <w:t>(a) $\frac{2}{3}$</w:t>
+      </w:r>
+    </w:p>
+    <w:p>
+      <w:pPr>
+        <w:spacing w:after="80"/>
+      </w:pPr>
+      <w:r>
+        <w:t>(b) $\frac{4}{5}$</w:t>
+      </w:r>
+    </w:p>
+    <w:p>
+      <w:pPr>
+        <w:spacing w:after="80"/>
+      </w:pPr>
+      <w:r>
+        <w:t>(c) $\frac{5}{6}$</w:t>
+      </w:r>
+    </w:p>
+    <w:p>
+      <w:pPr>
+        <w:spacing w:after="80"/>
+      </w:pPr>
+      <w:r>
+        <w:t>5. From each group given below, identify the set of like fractions: `[2]`</w:t>
+      </w:r>
+    </w:p>
+    <w:p>
+      <w:pPr>
+        <w:spacing w:after="80"/>
+      </w:pPr>
+      <w:r>
+        <w:t>(a) $\frac{2}{7}, \frac{5}{7}, \frac{9}{7}, \frac{3}{7}$</w:t>
+      </w:r>
+    </w:p>
+    <w:p>
+      <w:pPr>
+        <w:spacing w:after="80"/>
+      </w:pPr>
+      <w:r>
+        <w:t>(b) $\frac{3}{4}, \frac{3}{5}, \frac{3}{8}, \frac{3}{11}$</w:t>
+      </w:r>
+    </w:p>
+    <w:p>
+      <w:pPr>
+        <w:spacing w:after="80"/>
+      </w:pPr>
+      <w:r>
+        <w:t>(c) $\frac{1}{8}, \frac{3}{8}, \frac{5}{8}, \frac{7}{8}$</w:t>
+      </w:r>
+    </w:p>
+    <w:p>
+      <w:pPr>
+        <w:spacing w:after="80"/>
+      </w:pPr>
+      <w:r>
+        <w:t>6. Check whether the fractions $\frac{4}{6}$ and $\frac{20}{30}$ are equivalent or not. `[2]`</w:t>
+      </w:r>
+    </w:p>
+    <w:p>
+      <w:pPr>
+        <w:spacing w:after="80"/>
+      </w:pPr>
+      <w:r>
+        <w:t>7. Aarav ate $\frac{7}{4}$ of a pizza. Write this fraction as a mixed fraction and state whether Aarav ate more than one full pizza or less than one full pizza. `[2]`</w:t>
+      </w:r>
+    </w:p>
+    <w:p>
+      <w:pPr>
+        <w:spacing w:after="80"/>
+      </w:pPr>
+      <w:r>
+        <w:t>8. Which unit fraction is smaller: $\frac{1}{9}$ or $\frac{1}{15}$? Give a reason for your answer. `[1]`</w:t>
+      </w:r>
+    </w:p>
+    <w:p>
+      <w:pPr>
+        <w:spacing w:after="80"/>
+      </w:pPr>
+      <w:r>
+        <w:t>9. A tailor has $\frac{3}{4}\text{ metre}$ of silk cloth. He wants to write this amount as an equivalent fraction with a denominator of 12 to mark his measurements. What will be the new numerator? `[2]`</w:t>
+      </w:r>
+    </w:p>
+    <w:p>
+      <w:pPr>
+        <w:spacing w:after="80"/>
+      </w:pPr>
+      <w:r>
+        <w:t>10. Sana planned to read $\frac{3}{5}$ of her book in a day. By evening, she had read $\frac{12}{20}$ of the book. Did Sana achieve her reading goal? Explain your answer using the concept of equivalent fractions. `[2]`</w:t>
+      </w:r>
+    </w:p>
+    <w:p>
+      <w:r>
+        <w:rPr>
+          <w:color w:val="CBD5E1"/>
+        </w:rPr>
+        <w:t>____________________________________________________</w:t>
+      </w:r>
+    </w:p>
+    <w:p>
+      <w:pPr>
+        <w:pStyle w:val="Heading2"/>
+      </w:pPr>
+      <w:r>
+        <w:rPr>
+          <w:color w:val="0F172A"/>
+          <w:sz w:val="26"/>
+        </w:rPr>
+        <w:t>Exercise 8.2: Comparing, Adding &amp; Subtracting Unlike Fractions (Pages 143–144)</w:t>
+      </w:r>
+    </w:p>
+    <w:p>
+      <w:pPr>
+        <w:spacing w:after="80"/>
+      </w:pPr>
+      <w:r>
+        <w:t>1. Fill in the blanks using the correct sign ($&gt;, &lt;,$ or $=$): `[2]`</w:t>
+      </w:r>
+    </w:p>
+    <w:p>
+      <w:pPr>
+        <w:spacing w:after="80"/>
+      </w:pPr>
+      <w:r>
+        <w:t>(a) $\frac{5}{7} \;\Box\; \frac{3}{7}$</w:t>
+      </w:r>
+    </w:p>
+    <w:p>
+      <w:pPr>
+        <w:spacing w:after="80"/>
+      </w:pPr>
+      <w:r>
+        <w:t>(b) $\frac{1}{4} \;\Box\; \frac{1}{6}$</w:t>
+      </w:r>
+    </w:p>
+    <w:p>
+      <w:pPr>
+        <w:spacing w:after="80"/>
+      </w:pPr>
+      <w:r>
+        <w:t>(c) $\frac{3}{8} \;\Box\; \frac{5}{12}$</w:t>
+      </w:r>
+    </w:p>
+    <w:p>
+      <w:pPr>
+        <w:spacing w:after="80"/>
+      </w:pPr>
+      <w:r>
+        <w:t>(d) $\frac{7}{9} \;\Box\; \frac{14}{18}$</w:t>
+      </w:r>
+    </w:p>
+    <w:p>
+      <w:pPr>
+        <w:spacing w:after="80"/>
+      </w:pPr>
+      <w:r>
+        <w:t>2. Insert the correct sign ($&lt;, &gt;, =$): `[2]`</w:t>
+      </w:r>
+    </w:p>
+    <w:p>
+      <w:pPr>
+        <w:spacing w:after="80"/>
+      </w:pPr>
+      <w:r>
+        <w:t>(a) $\frac{2}{3} \;\Box\; \frac{5}{6}$</w:t>
+      </w:r>
+    </w:p>
+    <w:p>
+      <w:pPr>
+        <w:spacing w:after="80"/>
+      </w:pPr>
+      <w:r>
+        <w:t>(b) $\frac{7}{10} \;\Box\; \frac{4}{5}$</w:t>
+      </w:r>
+    </w:p>
+    <w:p>
+      <w:pPr>
+        <w:spacing w:after="80"/>
+      </w:pPr>
+      <w:r>
+        <w:t>(c) $\frac{5}{12} \;\Box\; \frac{7}{16}$</w:t>
+      </w:r>
+    </w:p>
+    <w:p>
+      <w:pPr>
+        <w:spacing w:after="80"/>
+      </w:pPr>
+      <w:r>
+        <w:t>3. Arrange the following fractions in ascending order: `[3]`</w:t>
+      </w:r>
+    </w:p>
+    <w:p>
+      <w:pPr>
+        <w:spacing w:after="80"/>
+      </w:pPr>
+      <w:r>
+        <w:t>(a) $\frac{2}{3}, \frac{5}{6}, \frac{7}{9}, \frac{1}{2}$</w:t>
+      </w:r>
+    </w:p>
+    <w:p>
+      <w:pPr>
+        <w:spacing w:after="80"/>
+      </w:pPr>
+      <w:r>
+        <w:t>(b) $\frac{3}{5}, \frac{7}{10}, \frac{4}{15}, \frac{1}{2}$</w:t>
+      </w:r>
+    </w:p>
+    <w:p>
+      <w:pPr>
+        <w:spacing w:after="80"/>
+      </w:pPr>
+      <w:r>
+        <w:t>4. Find the sum and write the answer as a mixed fraction: `[3]`</w:t>
+      </w:r>
+    </w:p>
+    <w:p>
+      <w:pPr>
+        <w:spacing w:after="80"/>
+      </w:pPr>
+      <w:r>
+        <w:t>(a) $3\frac{2}{5} + 2\frac{3}{4}$</w:t>
+      </w:r>
+    </w:p>
+    <w:p>
+      <w:pPr>
+        <w:spacing w:after="80"/>
+      </w:pPr>
+      <w:r>
+        <w:t>(b) $4\frac{1}{6} + 3\frac{5}{12}$</w:t>
+      </w:r>
+    </w:p>
+    <w:p>
+      <w:pPr>
+        <w:spacing w:after="80"/>
+      </w:pPr>
+      <w:r>
+        <w:t>(c) $2\frac{3}{8} + 1\frac{5}{6}$</w:t>
+      </w:r>
+    </w:p>
+    <w:p>
+      <w:pPr>
+        <w:spacing w:after="80"/>
+      </w:pPr>
+      <w:r>
+        <w:t>5. Subtract the following: `[3]`</w:t>
+      </w:r>
+    </w:p>
+    <w:p>
+      <w:pPr>
+        <w:spacing w:after="80"/>
+      </w:pPr>
+      <w:r>
+        <w:t>(a) $\frac{5}{6} - \frac{2}{5}$</w:t>
+      </w:r>
+    </w:p>
+    <w:p>
+      <w:pPr>
+        <w:spacing w:after="80"/>
+      </w:pPr>
+      <w:r>
+        <w:t>(b) $12 - 5\frac{4}{9}$</w:t>
+      </w:r>
+    </w:p>
+    <w:p>
+      <w:pPr>
+        <w:spacing w:after="80"/>
+      </w:pPr>
+      <w:r>
+        <w:t>(c) $8 - 3\frac{5}{6}$</w:t>
+      </w:r>
+    </w:p>
+    <w:p>
+      <w:pPr>
+        <w:spacing w:after="80"/>
+      </w:pPr>
+      <w:r>
+        <w:t>6. Evaluate: `[3]`</w:t>
+      </w:r>
+    </w:p>
+    <w:p>
+      <w:pPr>
+        <w:spacing w:after="80"/>
+      </w:pPr>
+      <w:r>
+        <w:t>(a) $3\frac{1}{2} - 1\frac{5}{6} + 2\frac{2}{3}$</w:t>
+      </w:r>
+    </w:p>
+    <w:p>
+      <w:pPr>
+        <w:spacing w:after="80"/>
+      </w:pPr>
+      <w:r>
+        <w:t>(b) $2\frac{3}{4} - \frac{1}{2} + 1\frac{1}{8}$</w:t>
+      </w:r>
+    </w:p>
+    <w:p>
+      <w:pPr>
+        <w:spacing w:after="80"/>
+      </w:pPr>
+      <w:r>
+        <w:t>7. A wire is $15\frac{3}{5}\text{ metres}$ long. If a piece of $6\frac{2}{3}\text{ metres}$ is cut off, find the length of the wire left. `[3]`</w:t>
+      </w:r>
+    </w:p>
+    <w:p>
+      <w:r>
+        <w:rPr>
+          <w:color w:val="CBD5E1"/>
+        </w:rPr>
+        <w:t>____________________________________________________</w:t>
+      </w:r>
+    </w:p>
+    <w:p>
+      <w:pPr>
+        <w:pStyle w:val="Heading2"/>
+      </w:pPr>
+      <w:r>
+        <w:rPr>
+          <w:color w:val="0F172A"/>
+          <w:sz w:val="26"/>
+        </w:rPr>
+        <w:t>Exercise 8.3: Multiplication of Fractions &amp; Lowest Form (Page 146)</w:t>
+      </w:r>
+    </w:p>
+    <w:p>
+      <w:pPr>
+        <w:spacing w:after="80"/>
+      </w:pPr>
+      <w:r>
+        <w:t>1. Multiply and simplify to lowest form: `[2]`</w:t>
+      </w:r>
+    </w:p>
+    <w:p>
+      <w:pPr>
+        <w:spacing w:after="80"/>
+      </w:pPr>
+      <w:r>
+        <w:t>(a) $\frac{2}{3} \times \frac{5}{4}$</w:t>
+      </w:r>
+    </w:p>
+    <w:p>
+      <w:pPr>
+        <w:spacing w:after="80"/>
+      </w:pPr>
+      <w:r>
+        <w:t>(b) $\frac{3}{8} \times \frac{4}{9}$</w:t>
+      </w:r>
+    </w:p>
+    <w:p>
+      <w:pPr>
+        <w:spacing w:after="80"/>
+      </w:pPr>
+      <w:r>
+        <w:t>(c) $2\frac{1}{3} \times 1\frac{1}{5}$</w:t>
+      </w:r>
+    </w:p>
+    <w:p>
+      <w:pPr>
+        <w:spacing w:after="80"/>
+      </w:pPr>
+      <w:r>
+        <w:t>(d) $\frac{5}{12} \times \frac{9}{10}$</w:t>
+      </w:r>
+    </w:p>
+    <w:p>
+      <w:pPr>
+        <w:spacing w:after="80"/>
+      </w:pPr>
+      <w:r>
+        <w:t>2. Convert into mixed fractions: `[2]`</w:t>
+      </w:r>
+    </w:p>
+    <w:p>
+      <w:pPr>
+        <w:spacing w:after="80"/>
+      </w:pPr>
+      <w:r>
+        <w:t>(a) $7 \times \frac{2}{3}$</w:t>
+      </w:r>
+    </w:p>
+    <w:p>
+      <w:pPr>
+        <w:spacing w:after="80"/>
+      </w:pPr>
+      <w:r>
+        <w:t>(b) $4 \times \frac{3}{5}$</w:t>
+      </w:r>
+    </w:p>
+    <w:p>
+      <w:pPr>
+        <w:spacing w:after="80"/>
+      </w:pPr>
+      <w:r>
+        <w:t>(c) $5 \times \frac{4}{7}$</w:t>
+      </w:r>
+    </w:p>
+    <w:p>
+      <w:pPr>
+        <w:spacing w:after="80"/>
+      </w:pPr>
+      <w:r>
+        <w:t>3. Find the area of a rectangular playground that is $14\frac{2}{5}\text{ metres}$ long and $9\frac{5}{8}\text{ metres}$ wide. `[3]`</w:t>
+      </w:r>
+    </w:p>
+    <w:p>
+      <w:pPr>
+        <w:spacing w:after="80"/>
+      </w:pPr>
+      <w:r>
+        <w:t>4. Evaluate: `[3]`</w:t>
+      </w:r>
+    </w:p>
+    <w:p>
+      <w:pPr>
+        <w:spacing w:after="80"/>
+      </w:pPr>
+      <w:r>
+        <w:t>(a) $\frac{3}{8}$ of $40$</w:t>
+      </w:r>
+    </w:p>
+    <w:p>
+      <w:pPr>
+        <w:spacing w:after="80"/>
+      </w:pPr>
+      <w:r>
+        <w:t>(b) $\frac{2}{3}$ of 1 hour (in minutes)</w:t>
+      </w:r>
+    </w:p>
+    <w:p>
+      <w:pPr>
+        <w:spacing w:after="80"/>
+      </w:pPr>
+      <w:r>
+        <w:t>(c) $\frac{3}{4}$ of 2 kilograms (in grams)</w:t>
+      </w:r>
+    </w:p>
+    <w:p>
+      <w:pPr>
+        <w:spacing w:after="80"/>
+      </w:pPr>
+      <w:r>
+        <w:t>5. A car runs $16\text{ km}$ using 1 litre of petrol. How much distance will it cover using $2\frac{3}{4}\text{ litres}$ of petrol? `[3]`</w:t>
+      </w:r>
+    </w:p>
+    <w:p>
+      <w:pPr>
+        <w:spacing w:after="80"/>
+      </w:pPr>
+      <w:r>
+        <w:t>6. Rohan has a novel containing 120 pages. He reads $\frac{3}{4}$ of the book. `[3]`</w:t>
+      </w:r>
+    </w:p>
+    <w:p>
+      <w:pPr>
+        <w:spacing w:after="80"/>
+      </w:pPr>
+      <w:r>
+        <w:t>(a) What fraction of the book has he not read?</w:t>
+      </w:r>
+    </w:p>
+    <w:p>
+      <w:pPr>
+        <w:spacing w:after="80"/>
+      </w:pPr>
+      <w:r>
+        <w:t>(b) How many pages has he read?</w:t>
+      </w:r>
+    </w:p>
+    <w:p>
+      <w:pPr>
+        <w:spacing w:after="80"/>
+      </w:pPr>
+      <w:r>
+        <w:t>(c) How many pages remain to be read?</w:t>
+      </w:r>
+    </w:p>
+    <w:p>
+      <w:pPr>
+        <w:spacing w:after="80"/>
+      </w:pPr>
+      <w:r>
+        <w:t>7. A water tanker supplies $32\frac{1}{2}\text{ kilolitres}$ of water in a day. $\frac{2}{5}$ of this water is used for household purposes. Find the amount of water used for household purposes. `[3]`</w:t>
+      </w:r>
+    </w:p>
+    <w:p>
+      <w:r>
+        <w:rPr>
+          <w:color w:val="CBD5E1"/>
+        </w:rPr>
+        <w:t>____________________________________________________</w:t>
+      </w:r>
+    </w:p>
+    <w:p>
+      <w:pPr>
+        <w:pStyle w:val="Heading2"/>
+      </w:pPr>
+      <w:r>
+        <w:rPr>
+          <w:color w:val="0F172A"/>
+          <w:sz w:val="26"/>
+        </w:rPr>
+        <w:t>Exercise 8.4: Division of Fractions &amp; Reciprocals (Pages 147–148)</w:t>
+      </w:r>
+    </w:p>
+    <w:p>
+      <w:pPr>
+        <w:spacing w:after="80"/>
+      </w:pPr>
+      <w:r>
+        <w:t>1. Write the reciprocal of each of the following: `[2]`</w:t>
+      </w:r>
+    </w:p>
+    <w:p>
+      <w:pPr>
+        <w:spacing w:after="80"/>
+      </w:pPr>
+      <w:r>
+        <w:t>(a) $\frac{7}{4}$</w:t>
+      </w:r>
+    </w:p>
+    <w:p>
+      <w:pPr>
+        <w:spacing w:after="80"/>
+      </w:pPr>
+      <w:r>
+        <w:t>(b) $\frac{1}{9}$</w:t>
+      </w:r>
+    </w:p>
+    <w:p>
+      <w:pPr>
+        <w:spacing w:after="80"/>
+      </w:pPr>
+      <w:r>
+        <w:t>(c) $2\frac{1}{3}$</w:t>
+      </w:r>
+    </w:p>
+    <w:p>
+      <w:pPr>
+        <w:spacing w:after="80"/>
+      </w:pPr>
+      <w:r>
+        <w:t>(d) $6$</w:t>
+      </w:r>
+    </w:p>
+    <w:p>
+      <w:pPr>
+        <w:spacing w:after="80"/>
+      </w:pPr>
+      <w:r>
+        <w:t>(e) $\frac{5}{8}$</w:t>
+      </w:r>
+    </w:p>
+    <w:p>
+      <w:pPr>
+        <w:spacing w:after="80"/>
+      </w:pPr>
+      <w:r>
+        <w:t>2. Divide: `[3]`</w:t>
+      </w:r>
+    </w:p>
+    <w:p>
+      <w:pPr>
+        <w:spacing w:after="80"/>
+      </w:pPr>
+      <w:r>
+        <w:t>(a) $4 \div \frac{1}{2}$</w:t>
+      </w:r>
+    </w:p>
+    <w:p>
+      <w:pPr>
+        <w:spacing w:after="80"/>
+      </w:pPr>
+      <w:r>
+        <w:t>(b) $\frac{3}{5} \div 6$</w:t>
+      </w:r>
+    </w:p>
+    <w:p>
+      <w:pPr>
+        <w:spacing w:after="80"/>
+      </w:pPr>
+      <w:r>
+        <w:t>(c) $5\frac{1}{4} \div 2\frac{1}{3}$</w:t>
+      </w:r>
+    </w:p>
+    <w:p>
+      <w:pPr>
+        <w:spacing w:after="80"/>
+      </w:pPr>
+      <w:r>
+        <w:t>(d) $\frac{7}{9} \div \frac{14}{27}$</w:t>
+      </w:r>
+    </w:p>
+    <w:p>
+      <w:pPr>
+        <w:spacing w:after="80"/>
+      </w:pPr>
+      <w:r>
+        <w:t>(e) $9 \div \frac{3}{4}$</w:t>
+      </w:r>
+    </w:p>
+    <w:p>
+      <w:pPr>
+        <w:spacing w:after="80"/>
+      </w:pPr>
+      <w:r>
+        <w:t>3. A rope of length $15\frac{3}{4}\text{ metres}$ is cut into equal pieces of length $\frac{3}{4}\text{ metre}$ each. Find the number of pieces. `[3]`</w:t>
+      </w:r>
+    </w:p>
+    <w:p>
+      <w:pPr>
+        <w:spacing w:after="80"/>
+      </w:pPr>
+      <w:r>
+        <w:t>4. A shopkeeper has $27\text{ kg}$ of dry fruits. He distributes them equally among 36 children. How many grams of dry fruits does each child receive? `[3]`</w:t>
+      </w:r>
+    </w:p>
+    <w:p>
+      <w:pPr>
+        <w:spacing w:after="80"/>
+      </w:pPr>
+      <w:r>
+        <w:t>5. A garden plot is divided into 4 equal sections. $\frac{2}{3}$ of each section is planted with flowers. What fraction of the entire garden is planted with flowers? If the total area of the garden is $240\text{ m}^2$, find the planted area. `[3]`</w:t>
+      </w:r>
+    </w:p>
+    <w:p>
+      <w:pPr>
+        <w:spacing w:after="80"/>
+      </w:pPr>
+      <w:r>
+        <w:t>6. The cost of $7\frac{1}{2}\text{ kg}$ of sugar is ₹$340$. Find the price of $1\text{ kg}$ of sugar. `[3]`</w:t>
+      </w:r>
+    </w:p>
+    <w:p>
+      <w:pPr>
+        <w:spacing w:after="80"/>
+      </w:pPr>
+      <w:r>
+        <w:t>7. A wire of length $18\frac{3}{4}\text{ metres}$ is distributed equally among 15 students for a science project. Find the length of wire received by each student. `[3]`</w:t>
+      </w:r>
+    </w:p>
+    <w:p>
+      <w:pPr>
+        <w:spacing w:after="80"/>
+      </w:pPr>
+      <w:r>
+        <w:t>8. A tailor uses $2\frac{1}{4}\text{ metres}$ of cloth to stitch one shirt. How many such shirts can be stitched from a roll of $33\frac{3}{4}\text{ metres}$? `[3]`</w:t>
+      </w:r>
+    </w:p>
+    <w:p>
+      <w:pPr>
+        <w:spacing w:after="80"/>
+      </w:pPr>
+      <w:r>
+        <w:t>9. Mira is reading a novel that has 480 pages. She read $\frac{5}{8}$ of the pages today. How many more pages does she need to read to complete the book? `[3]`</w:t>
+      </w:r>
+    </w:p>
+    <w:p>
+      <w:pPr>
+        <w:spacing w:after="80"/>
+      </w:pPr>
+      <w:r>
+        <w:t>10. A car travels a distance of $202\frac{1}{2}\text{ km}$ in $4\frac{1}{2}\text{ hours}$. What is the average speed of the car in $\text{km/h}$? `[3]`</w:t>
+      </w:r>
+    </w:p>
+    <w:p>
+      <w:r>
+        <w:rPr>
+          <w:color w:val="CBD5E1"/>
+        </w:rPr>
+        <w:t>____________________________________________________</w:t>
+      </w:r>
+    </w:p>
+    <w:p>
+      <w:pPr>
+        <w:pStyle w:val="Heading2"/>
+      </w:pPr>
+      <w:r>
+        <w:rPr>
+          <w:color w:val="0F172A"/>
+          <w:sz w:val="26"/>
+        </w:rPr>
+        <w:t>Chapter 8 Drill (Pages 150–153)</w:t>
+      </w:r>
+    </w:p>
+    <w:p>
+      <w:pPr>
+        <w:pStyle w:val="Heading3"/>
+      </w:pPr>
+      <w:r>
+        <w:rPr>
+          <w:color w:val="0369A1"/>
+          <w:sz w:val="22"/>
+        </w:rPr>
+        <w:t>Section A: Multiple Choice Questions (1 Mark each)</w:t>
+      </w:r>
+    </w:p>
+    <w:p>
+      <w:pPr>
+        <w:spacing w:after="80"/>
+      </w:pPr>
+      <w:r>
+        <w:t>1. Which of the following is a unit fraction?</w:t>
+      </w:r>
+    </w:p>
+    <w:p>
+      <w:pPr>
+        <w:spacing w:after="80"/>
+      </w:pPr>
+      <w:r>
+        <w:t>(a) $\frac{4}{1}$</w:t>
+      </w:r>
+    </w:p>
+    <w:p>
+      <w:pPr>
+        <w:spacing w:after="80"/>
+      </w:pPr>
+      <w:r>
+        <w:t>(b) $\frac{1}{7}$</w:t>
+      </w:r>
+    </w:p>
+    <w:p>
+      <w:pPr>
+        <w:spacing w:after="80"/>
+      </w:pPr>
+      <w:r>
+        <w:t>(c) $\frac{7}{4}$</w:t>
+      </w:r>
+    </w:p>
+    <w:p>
+      <w:pPr>
+        <w:spacing w:after="80"/>
+      </w:pPr>
+      <w:r>
+        <w:t>(d) $\frac{4}{7}$</w:t>
+      </w:r>
+    </w:p>
+    <w:p>
+      <w:pPr>
+        <w:spacing w:after="80"/>
+      </w:pPr>
+      <w:r>
+        <w:t>2. The reciprocal of $2\frac{1}{3}$ is:</w:t>
+      </w:r>
+    </w:p>
+    <w:p>
+      <w:pPr>
+        <w:spacing w:after="80"/>
+      </w:pPr>
+      <w:r>
+        <w:t>(a) $\frac{7}{3}$</w:t>
+      </w:r>
+    </w:p>
+    <w:p>
+      <w:pPr>
+        <w:spacing w:after="80"/>
+      </w:pPr>
+      <w:r>
+        <w:t>(b) $\frac{3}{7}$</w:t>
+      </w:r>
+    </w:p>
+    <w:p>
+      <w:pPr>
+        <w:spacing w:after="80"/>
+      </w:pPr>
+      <w:r>
+        <w:t>(c) $\frac{1}{7}$</w:t>
+      </w:r>
+    </w:p>
+    <w:p>
+      <w:pPr>
+        <w:spacing w:after="80"/>
+      </w:pPr>
+      <w:r>
+        <w:t>(d) $2\frac{3}{1}$</w:t>
+      </w:r>
+    </w:p>
+    <w:p>
+      <w:pPr>
+        <w:spacing w:after="80"/>
+      </w:pPr>
+      <w:r>
+        <w:t>3. To compare $\frac{2}{5}$ and $\frac{3}{4}$, the common denominator should be:</w:t>
+      </w:r>
+    </w:p>
+    <w:p>
+      <w:pPr>
+        <w:spacing w:after="80"/>
+      </w:pPr>
+      <w:r>
+        <w:t>(a) 5</w:t>
+      </w:r>
+    </w:p>
+    <w:p>
+      <w:pPr>
+        <w:spacing w:after="80"/>
+      </w:pPr>
+      <w:r>
+        <w:t>(b) 4</w:t>
+      </w:r>
+    </w:p>
+    <w:p>
+      <w:pPr>
+        <w:spacing w:after="80"/>
+      </w:pPr>
+      <w:r>
+        <w:t>(c) 20</w:t>
+      </w:r>
+    </w:p>
+    <w:p>
+      <w:pPr>
+        <w:spacing w:after="80"/>
+      </w:pPr>
+      <w:r>
+        <w:t>(d) 10</w:t>
+      </w:r>
+    </w:p>
+    <w:p>
+      <w:pPr>
+        <w:spacing w:after="80"/>
+      </w:pPr>
+      <w:r>
+        <w:t>4. A fraction is in its simplest form if its numerator and denominator are:</w:t>
+      </w:r>
+    </w:p>
+    <w:p>
+      <w:pPr>
+        <w:spacing w:after="80"/>
+      </w:pPr>
+      <w:r>
+        <w:t>(a) Equal</w:t>
+      </w:r>
+    </w:p>
+    <w:p>
+      <w:pPr>
+        <w:spacing w:after="80"/>
+      </w:pPr>
+      <w:r>
+        <w:t>(b) Co-prime</w:t>
+      </w:r>
+    </w:p>
+    <w:p>
+      <w:pPr>
+        <w:spacing w:after="80"/>
+      </w:pPr>
+      <w:r>
+        <w:t>(c) Prime numbers</w:t>
+      </w:r>
+    </w:p>
+    <w:p>
+      <w:pPr>
+        <w:spacing w:after="80"/>
+      </w:pPr>
+      <w:r>
+        <w:t>(d) Even numbers</w:t>
+      </w:r>
+    </w:p>
+    <w:p>
+      <w:pPr>
+        <w:spacing w:after="80"/>
+      </w:pPr>
+      <w:r>
+        <w:t>5. What is $\frac{3}{4}$ of $16$?</w:t>
+      </w:r>
+    </w:p>
+    <w:p>
+      <w:pPr>
+        <w:spacing w:after="80"/>
+      </w:pPr>
+      <w:r>
+        <w:t>(a) 12</w:t>
+      </w:r>
+    </w:p>
+    <w:p>
+      <w:pPr>
+        <w:spacing w:after="80"/>
+      </w:pPr>
+      <w:r>
+        <w:t>(b) 8</w:t>
+      </w:r>
+    </w:p>
+    <w:p>
+      <w:pPr>
+        <w:spacing w:after="80"/>
+      </w:pPr>
+      <w:r>
+        <w:t>(c) 4</w:t>
+      </w:r>
+    </w:p>
+    <w:p>
+      <w:pPr>
+        <w:spacing w:after="80"/>
+      </w:pPr>
+      <w:r>
+        <w:t>(d) 16</w:t>
+      </w:r>
+    </w:p>
+    <w:p>
+      <w:pPr>
+        <w:spacing w:after="80"/>
+      </w:pPr>
+      <w:r>
+        <w:t>6. Which symbol makes the statement true: $\frac{3}{4} \;\Box\; \frac{9}{12}$?</w:t>
+      </w:r>
+    </w:p>
+    <w:p>
+      <w:pPr>
+        <w:spacing w:after="80"/>
+      </w:pPr>
+      <w:r>
+        <w:t>(a) $&gt;$</w:t>
+      </w:r>
+    </w:p>
+    <w:p>
+      <w:pPr>
+        <w:spacing w:after="80"/>
+      </w:pPr>
+      <w:r>
+        <w:t>(b) $&lt;$</w:t>
+      </w:r>
+    </w:p>
+    <w:p>
+      <w:pPr>
+        <w:spacing w:after="80"/>
+      </w:pPr>
+      <w:r>
+        <w:t>(c) $=$</w:t>
+      </w:r>
+    </w:p>
+    <w:p>
+      <w:pPr>
+        <w:spacing w:after="80"/>
+      </w:pPr>
+      <w:r>
+        <w:t>(d) $\le$</w:t>
+      </w:r>
+    </w:p>
+    <w:p>
+      <w:pPr>
+        <w:spacing w:after="80"/>
+      </w:pPr>
+      <w:r>
+        <w:t>7. An improper fraction is always:</w:t>
+      </w:r>
+    </w:p>
+    <w:p>
+      <w:pPr>
+        <w:spacing w:after="80"/>
+      </w:pPr>
+      <w:r>
+        <w:t>(a) Less than 1</w:t>
+      </w:r>
+    </w:p>
+    <w:p>
+      <w:pPr>
+        <w:spacing w:after="80"/>
+      </w:pPr>
+      <w:r>
+        <w:t>(b) Greater than or equal to 1</w:t>
+      </w:r>
+    </w:p>
+    <w:p>
+      <w:pPr>
+        <w:spacing w:after="80"/>
+      </w:pPr>
+      <w:r>
+        <w:t>(c) Equal to 1</w:t>
+      </w:r>
+    </w:p>
+    <w:p>
+      <w:pPr>
+        <w:spacing w:after="80"/>
+      </w:pPr>
+      <w:r>
+        <w:t>(d) A unit fraction</w:t>
+      </w:r>
+    </w:p>
+    <w:p>
+      <w:pPr>
+        <w:spacing w:after="80"/>
+      </w:pPr>
+      <w:r>
+        <w:t>8. $4 \div \frac{1}{2}$ is equal to:</w:t>
+      </w:r>
+    </w:p>
+    <w:p>
+      <w:pPr>
+        <w:spacing w:after="80"/>
+      </w:pPr>
+      <w:r>
+        <w:t>(a) 2</w:t>
+      </w:r>
+    </w:p>
+    <w:p>
+      <w:pPr>
+        <w:spacing w:after="80"/>
+      </w:pPr>
+      <w:r>
+        <w:t>(b) 8</w:t>
+      </w:r>
+    </w:p>
+    <w:p>
+      <w:pPr>
+        <w:spacing w:after="80"/>
+      </w:pPr>
+      <w:r>
+        <w:t>(c) $\frac{1}{8}$</w:t>
+      </w:r>
+    </w:p>
+    <w:p>
+      <w:pPr>
+        <w:spacing w:after="80"/>
+      </w:pPr>
+      <w:r>
+        <w:t>(d) 4</w:t>
+      </w:r>
+    </w:p>
+    <w:p>
+      <w:pPr>
+        <w:spacing w:after="80"/>
+      </w:pPr>
+      <w:r>
+        <w:t>9. An equivalent fraction of $\frac{2}{3}$ with denominator 12 is:</w:t>
+      </w:r>
+    </w:p>
+    <w:p>
+      <w:pPr>
+        <w:spacing w:after="80"/>
+      </w:pPr>
+      <w:r>
+        <w:t>(a) $\frac{4}{12}$</w:t>
+      </w:r>
+    </w:p>
+    <w:p>
+      <w:pPr>
+        <w:spacing w:after="80"/>
+      </w:pPr>
+      <w:r>
+        <w:t>(b) $\frac{8}{12}$</w:t>
+      </w:r>
+    </w:p>
+    <w:p>
+      <w:pPr>
+        <w:spacing w:after="80"/>
+      </w:pPr>
+      <w:r>
+        <w:t>(c) $\frac{6}{12}$</w:t>
+      </w:r>
+    </w:p>
+    <w:p>
+      <w:pPr>
+        <w:spacing w:after="80"/>
+      </w:pPr>
+      <w:r>
+        <w:t>(d) $\frac{10}{12}$</w:t>
+      </w:r>
+    </w:p>
+    <w:p>
+      <w:pPr>
+        <w:spacing w:after="80"/>
+      </w:pPr>
+      <w:r>
+        <w:t>10. If $\frac{5}{8} = \frac{15}{x}$, then the value of $x$ is:</w:t>
+      </w:r>
+    </w:p>
+    <w:p>
+      <w:pPr>
+        <w:spacing w:after="80"/>
+      </w:pPr>
+      <w:r>
+        <w:t>(a) 16</w:t>
+      </w:r>
+    </w:p>
+    <w:p>
+      <w:pPr>
+        <w:spacing w:after="80"/>
+      </w:pPr>
+      <w:r>
+        <w:t>(b) 24</w:t>
+      </w:r>
+    </w:p>
+    <w:p>
+      <w:pPr>
+        <w:spacing w:after="80"/>
+      </w:pPr>
+      <w:r>
+        <w:t>(c) 30</w:t>
+      </w:r>
+    </w:p>
+    <w:p>
+      <w:pPr>
+        <w:spacing w:after="80"/>
+      </w:pPr>
+      <w:r>
+        <w:t>(d) 40</w:t>
+      </w:r>
+    </w:p>
+    <w:p>
+      <w:pPr>
+        <w:pStyle w:val="Heading3"/>
+      </w:pPr>
+      <w:r>
+        <w:rPr>
+          <w:color w:val="0369A1"/>
+          <w:sz w:val="22"/>
+        </w:rPr>
+        <w:t>Section B: Fill in the Blanks (1 Mark each)</w:t>
+      </w:r>
+    </w:p>
+    <w:p>
+      <w:pPr>
+        <w:spacing w:after="80"/>
+      </w:pPr>
+      <w:r>
+        <w:t>1. The number that does not have a reciprocal is $\underline{\hspace{3cm}}$.</w:t>
+      </w:r>
+    </w:p>
+    <w:p>
+      <w:pPr>
+        <w:spacing w:after="80"/>
+      </w:pPr>
+      <w:r>
+        <w:t>2. In the fraction $\frac{7}{11}$, the top number 7 is called the $\underline{\hspace{3cm}}$.</w:t>
+      </w:r>
+    </w:p>
+    <w:p>
+      <w:pPr>
+        <w:spacing w:after="80"/>
+      </w:pPr>
+      <w:r>
+        <w:t>3. Fractions with the same denominator are called $\underline{\hspace{3cm}}$ fractions.</w:t>
+      </w:r>
+    </w:p>
+    <w:p>
+      <w:pPr>
+        <w:spacing w:after="80"/>
+      </w:pPr>
+      <w:r>
+        <w:t>4. While dividing fractions, we multiply by the $\underline{\hspace{3cm}}$ of the divisor.</w:t>
+      </w:r>
+    </w:p>
+    <w:p>
+      <w:pPr>
+        <w:spacing w:after="80"/>
+      </w:pPr>
+      <w:r>
+        <w:t>5. The product of $\frac{3}{5} \times \frac{5}{3}$ is $\underline{\hspace{3cm}}$.</w:t>
+      </w:r>
+    </w:p>
+    <w:p>
+      <w:pPr>
+        <w:spacing w:after="80"/>
+      </w:pPr>
+      <w:r>
+        <w:t>6. A fraction written as $3\frac{1}{2}$ is called a $\underline{\hspace{3cm}}$ fraction.</w:t>
+      </w:r>
+    </w:p>
+    <w:p>
+      <w:pPr>
+        <w:pStyle w:val="Heading3"/>
+      </w:pPr>
+      <w:r>
+        <w:rPr>
+          <w:color w:val="0369A1"/>
+          <w:sz w:val="22"/>
+        </w:rPr>
+        <w:t>Section C: Very Short Answer Questions (1 Mark each)</w:t>
+      </w:r>
+    </w:p>
+    <w:p>
+      <w:pPr>
+        <w:spacing w:after="80"/>
+      </w:pPr>
+      <w:r>
+        <w:t>1. Define a proper fraction and give one example. `[1]`</w:t>
+      </w:r>
+    </w:p>
+    <w:p>
+      <w:pPr>
+        <w:spacing w:after="80"/>
+      </w:pPr>
+      <w:r>
+        <w:t>2. Convert $\frac{22}{4}$ into a mixed fraction. `[1]`</w:t>
+      </w:r>
+    </w:p>
+    <w:p>
+      <w:pPr>
+        <w:spacing w:after="80"/>
+      </w:pPr>
+      <w:r>
+        <w:t>3. Find the HCF of 24 and 36, and use it to simplify $\frac{24}{36}$. `[1]`</w:t>
+      </w:r>
+    </w:p>
+    <w:p>
+      <w:pPr>
+        <w:spacing w:after="80"/>
+      </w:pPr>
+      <w:r>
+        <w:t>4. Write the reciprocal of $3\frac{1}{5}$. `[1]`</w:t>
+      </w:r>
+    </w:p>
+    <w:p>
+      <w:pPr>
+        <w:spacing w:after="80"/>
+      </w:pPr>
+      <w:r>
+        <w:t>5. Is $\frac{12}{12}$ a proper fraction or an improper fraction? Give a reason. `[1]`</w:t>
+      </w:r>
+    </w:p>
+    <w:p>
+      <w:pPr>
+        <w:spacing w:after="80"/>
+      </w:pPr>
+      <w:r>
+        <w:t>6. Multiply $9 \times \frac{4}{27}$. `[1]`</w:t>
+      </w:r>
+    </w:p>
+    <w:p>
+      <w:pPr>
+        <w:spacing w:after="80"/>
+      </w:pPr>
+      <w:r>
+        <w:t>7. Write the next two equivalent fractions for $\frac{3}{7}$. `[1]`</w:t>
+      </w:r>
+    </w:p>
+    <w:p>
+      <w:pPr>
+        <w:spacing w:after="80"/>
+      </w:pPr>
+      <w:r>
+        <w:t>8. Compare $\frac{5}{8}$ and $\frac{7}{12}$ using any suitable method. `[1]`</w:t>
+      </w:r>
+    </w:p>
+    <w:p>
+      <w:pPr>
+        <w:spacing w:after="80"/>
+      </w:pPr>
+      <w:r>
+        <w:t>9. How many $\frac{2}{3}\text{ kg}$ pieces can be cut from a cake of weight $4\text{ kg}$? `[1]`</w:t>
+      </w:r>
+    </w:p>
+    <w:p>
+      <w:pPr>
+        <w:spacing w:after="80"/>
+      </w:pPr>
+      <w:r>
+        <w:t>10. Divide $\frac{5}{8}$ by $\left(\frac{3}{4} \text{ of } \frac{5}{6}\right)$. `[1]`</w:t>
+      </w:r>
+    </w:p>
+    <w:p>
+      <w:pPr>
+        <w:spacing w:after="80"/>
+      </w:pPr>
+      <w:r>
+        <w:t>11. Which is heavier: $\frac{12}{25}$ of $500\text{ grams}$ or $\frac{3}{20}$ of $4\text{ kg}$? `[1]`</w:t>
+      </w:r>
+    </w:p>
+    <w:p>
+      <w:pPr>
+        <w:pStyle w:val="Heading3"/>
+      </w:pPr>
+      <w:r>
+        <w:rPr>
+          <w:color w:val="0369A1"/>
+          <w:sz w:val="22"/>
+        </w:rPr>
+        <w:t>Section D: Short Answer Questions (2 Marks each)</w:t>
+      </w:r>
+    </w:p>
+    <w:p>
+      <w:pPr>
+        <w:spacing w:after="80"/>
+      </w:pPr>
+      <w:r>
+        <w:t>1. Simplify $\frac{72}{108}$ using the cancellation method, showing all steps. `[2]`</w:t>
+      </w:r>
+    </w:p>
+    <w:p>
+      <w:pPr>
+        <w:spacing w:after="80"/>
+      </w:pPr>
+      <w:r>
+        <w:t>2. Arrange the fractions $\frac{2}{3}, \frac{5}{6}, \frac{7}{12}$ in ascending order. `[2]`</w:t>
+      </w:r>
+    </w:p>
+    <w:p>
+      <w:pPr>
+        <w:spacing w:after="80"/>
+      </w:pPr>
+      <w:r>
+        <w:t>3. A rope is $\frac{3}{4}\text{ metre}$ long. How many such ropes are required to make $6\text{ metres}$? `[2]`</w:t>
+      </w:r>
+    </w:p>
+    <w:p>
+      <w:pPr>
+        <w:spacing w:after="80"/>
+      </w:pPr>
+      <w:r>
+        <w:t>4. Find the value of $x$ if $\frac{x}{7} = \frac{15}{35}$. `[2]`</w:t>
+      </w:r>
+    </w:p>
+    <w:p>
+      <w:pPr>
+        <w:spacing w:after="80"/>
+      </w:pPr>
+      <w:r>
+        <w:t>5. Convert the mixed fraction $7\frac{3}{8}$ into an improper fraction and then find its reciprocal. `[2]`</w:t>
+      </w:r>
+    </w:p>
+    <w:p>
+      <w:pPr>
+        <w:spacing w:after="80"/>
+      </w:pPr>
+      <w:r>
+        <w:t>6. Solve: $\left(2\frac{1}{2} \times 1\frac{1}{5}\right) \div \frac{3}{4}$. `[2]`</w:t>
+      </w:r>
+    </w:p>
+    <w:p>
+      <w:pPr>
+        <w:pStyle w:val="Heading3"/>
+      </w:pPr>
+      <w:r>
+        <w:rPr>
+          <w:color w:val="0369A1"/>
+          <w:sz w:val="22"/>
+        </w:rPr>
+        <w:t>Section E: Long Answer Questions (4 Marks each)</w:t>
+      </w:r>
+    </w:p>
+    <w:p>
+      <w:pPr>
+        <w:spacing w:after="80"/>
+      </w:pPr>
+      <w:r>
+        <w:t>1. The area of a rectangular plot is $65\frac{1}{3}\text{ m}^2$. If its breadth is $5\frac{1}{3}\text{ metres}$, find its length. `[4]`</w:t>
+      </w:r>
+    </w:p>
+    <w:p>
+      <w:pPr>
+        <w:spacing w:after="80"/>
+      </w:pPr>
+      <w:r>
+        <w:t>2. $18\frac{3}{4}\text{ litres}$ of juice is poured into small bottles of capacity $\frac{3}{4}\text{ litre}$ each. How many bottles can be filled completely? `[4]`</w:t>
+      </w:r>
+    </w:p>
+    <w:p>
+      <w:pPr>
+        <w:spacing w:after="80"/>
+      </w:pPr>
+      <w:r>
+        <w:t>3. Mili reads $\frac{1}{3}$ part of a book in 1 hour. How much part of the book will she read in $2\frac{1}{5}\text{ hours}$? `[4]`</w:t>
+      </w:r>
+    </w:p>
+    <w:p>
+      <w:pPr>
+        <w:spacing w:after="80"/>
+      </w:pPr>
+      <w:r>
+        <w:t>4. Vidya and Pratap went for a picnic. Their mother gave them a water bottle that contained $5\text{ litres}$ of water. Vidya consumed $\frac{2}{5}$ of the water. Pratap consumed the remaining water. `[4]`</w:t>
+      </w:r>
+    </w:p>
+    <w:p>
+      <w:pPr>
+        <w:spacing w:after="80"/>
+      </w:pPr>
+      <w:r>
+        <w:t>(a) How much water did Vidya drink?</w:t>
+      </w:r>
+    </w:p>
+    <w:p>
+      <w:pPr>
+        <w:spacing w:after="80"/>
+      </w:pPr>
+      <w:r>
+        <w:t>(b) What fraction of the total quantity of water did Pratap drink?</w:t>
+      </w:r>
+    </w:p>
+    <w:p>
+      <w:pPr>
+        <w:spacing w:after="80"/>
+      </w:pPr>
+      <w:r>
+        <w:t>5. Saili plants 4 saplings in a row in her garden. The distance between two adjacent saplings is $\frac{3}{4}\text{ metre}$. Find the distance between the first and the last sapling. `[4]`</w:t>
+      </w:r>
+    </w:p>
+    <w:p>
+      <w:pPr>
+        <w:spacing w:after="80"/>
+      </w:pPr>
+      <w:r>
+        <w:t>6. In a class of 40 students, $\frac{1}{5}$ of the total students like to study English, $\frac{2}{5}$ like to study Mathematics, and the remaining students like to study Science. `[4]`</w:t>
+      </w:r>
+    </w:p>
+    <w:p>
+      <w:pPr>
+        <w:spacing w:after="80"/>
+      </w:pPr>
+      <w:r>
+        <w:t>(a) How many students like to study English?</w:t>
+      </w:r>
+    </w:p>
+    <w:p>
+      <w:pPr>
+        <w:spacing w:after="80"/>
+      </w:pPr>
+      <w:r>
+        <w:t>(b) How many students like to study Mathematics?</w:t>
+      </w:r>
+    </w:p>
+    <w:p>
+      <w:pPr>
+        <w:spacing w:after="80"/>
+      </w:pPr>
+      <w:r>
+        <w:t>(c) What fraction of the total students like to study Science?</w:t>
+      </w:r>
+    </w:p>
+    <w:p>
+      <w:pPr>
+        <w:spacing w:after="80"/>
+      </w:pPr>
+      <w:r>
+        <w:t>7. A cement company earns a profit of ₹8 per bag of white cement sold and a loss of ₹5 per bag of grey cement sold. If it sells 3,000 bags of white cement and 5,000 bags of grey cement in a month, calculate its net profit or loss. `[4]`</w:t>
+      </w:r>
+    </w:p>
+    <w:p>
+      <w:pPr>
+        <w:spacing w:after="80"/>
+      </w:pPr>
+      <w:r>
+        <w:t>8. Evaluate: $\left(\frac{2}{3} + \frac{1}{2}\right) \times \left(\frac{5}{6} - \frac{1}{4}\right) \div \frac{7}{12}$. `[4]`</w:t>
+      </w:r>
+    </w:p>
+    <w:p>
+      <w:pPr>
+        <w:spacing w:after="80"/>
+      </w:pPr>
+      <w:r>
+        <w:t>9. A rectangular field is $24\frac{1}{2}\text{ m}$ long and $15\text{ m}$ broad. Find its perimeter and the total cost of fencing it at ₹20 per metre. `[4]`</w:t>
+      </w:r>
+    </w:p>
+    <w:p>
+      <w:pPr>
+        <w:spacing w:after="80"/>
+      </w:pPr>
+      <w:r>
+        <w:t>10. A family consumes $3\frac{1}{2}\text{ kg}$ of rice in a week. How much rice will they consume in $4\frac{2}{7}\text{ weeks}$? `[4]`</w:t>
+      </w:r>
+    </w:p>
+    <w:p>
+      <w:pPr>
+        <w:pStyle w:val="Heading3"/>
+      </w:pPr>
+      <w:r>
+        <w:rPr>
+          <w:color w:val="0369A1"/>
+          <w:sz w:val="22"/>
+        </w:rPr>
+        <w:t>Section F: HOTS &amp; Life Skills (Page 153)</w:t>
+      </w:r>
+    </w:p>
+    <w:p>
+      <w:pPr>
+        <w:spacing w:after="80"/>
+      </w:pPr>
+      <w:r>
+        <w:t>1. Shade $\frac{1}{2}$ of a rectangle. Now, divide the shaded part into 3 equal parts and take one part. What fraction of the original rectangle is this? `[2]`</w:t>
+      </w:r>
+    </w:p>
+    <w:p>
+      <w:pPr>
+        <w:spacing w:after="80"/>
+      </w:pPr>
+      <w:r>
+        <w:t>2. What is the reciprocal of $\frac{1}{5}$? `[1]`</w:t>
+      </w:r>
+    </w:p>
+    <w:p>
+      <w:pPr>
+        <w:spacing w:after="80"/>
+      </w:pPr>
+      <w:r>
+        <w:t>3. Which is greater: $\frac{1}{2}$ of $20$ or $\frac{1}{4}$ of $40$? `[2]`</w:t>
+      </w:r>
+    </w:p>
+    <w:p>
+      <w:pPr>
+        <w:spacing w:after="80"/>
+      </w:pPr>
+      <w:r>
+        <w:t>4. If you have $\frac{3}{4}$ of a pizza and share it equally among 3 people, what fraction of a whole pizza does each person receive? `[2]`</w:t>
+      </w:r>
+    </w:p>
+    <w:p>
+      <w:pPr>
+        <w:spacing w:after="80"/>
+      </w:pPr>
+      <w:r>
+        <w:t>5. How does sharing resources (like fractional portions of food, time, or knowledge) build empathy and community cooperation? `[2]`</w:t>
+      </w:r>
+    </w:p>
+    <w:p>
+      <w:r>
+        <w:rPr>
+          <w:color w:val="CBD5E1"/>
+        </w:rPr>
+        <w:t>____________________________________________________</w:t>
+      </w:r>
+    </w:p>
+    <w:p>
+      <w:r>
+        <w:rPr>
+          <w:color w:val="CBD5E1"/>
+        </w:rPr>
+        <w:t>____________________________________________________</w:t>
+      </w:r>
+    </w:p>
+    <w:p>
+      <w:pPr>
+        <w:pStyle w:val="Heading1"/>
+      </w:pPr>
+      <w:r>
+        <w:rPr>
+          <w:color w:val="0369A1"/>
+          <w:sz w:val="36"/>
+        </w:rPr>
+        <w:t>PART III: TIMED MODEL ASSESSMENT TEST (40 MARKS)</w:t>
+      </w:r>
+    </w:p>
+    <w:p>
+      <w:pPr>
+        <w:spacing w:after="80"/>
+      </w:pPr>
+      <w:r>
+        <w:t>**Time Allowed:** 1 Hour | **Maximum Marks:** 40 Marks</w:t>
       </w:r>
     </w:p>
     <w:p>
@@ -96,18 +3806,6 @@
     </w:p>
     <w:p>
       <w:pPr>
-        <w:pStyle w:val="Heading4"/>
-      </w:pPr>
-      <w:r>
-        <w:rPr>
-          <w:color w:val="334155"/>
-          <w:sz w:val="20"/>
-        </w:rPr>
-        <w:t>I. Multiple Choice Questions (1 Mark each)</w:t>
-      </w:r>
-    </w:p>
-    <w:p>
-      <w:pPr>
         <w:spacing w:after="80"/>
       </w:pPr>
       <w:r>
@@ -231,151 +3929,119 @@
         <w:spacing w:after="80"/>
       </w:pPr>
       <w:r>
-        <w:t>4. A triangle in which all three sides are of unequal lengths is known as: `[1]`</w:t>
-      </w:r>
-    </w:p>
-    <w:p>
-      <w:pPr>
-        <w:spacing w:after="80"/>
-      </w:pPr>
-      <w:r>
-        <w:t>(a) Equilateral triangle</w:t>
-      </w:r>
-    </w:p>
-    <w:p>
-      <w:pPr>
-        <w:spacing w:after="80"/>
-      </w:pPr>
-      <w:r>
-        <w:t>(b) Isosceles triangle</w:t>
-      </w:r>
-    </w:p>
-    <w:p>
-      <w:pPr>
-        <w:spacing w:after="80"/>
-      </w:pPr>
-      <w:r>
-        <w:t>(c) Scalene triangle</w:t>
-      </w:r>
-    </w:p>
-    <w:p>
-      <w:pPr>
-        <w:spacing w:after="80"/>
-      </w:pPr>
-      <w:r>
-        <w:t>(d) Right-angled triangle</w:t>
-      </w:r>
-    </w:p>
-    <w:p>
-      <w:pPr>
-        <w:spacing w:after="80"/>
-      </w:pPr>
-      <w:r>
-        <w:t>5. In a right-angled triangle, if one acute angle is $42^\circ$, the other acute angle is: `[1]`</w:t>
-      </w:r>
-    </w:p>
-    <w:p>
-      <w:pPr>
-        <w:spacing w:after="80"/>
-      </w:pPr>
-      <w:r>
-        <w:t>(a) $42^\circ$</w:t>
-      </w:r>
-    </w:p>
-    <w:p>
-      <w:pPr>
-        <w:spacing w:after="80"/>
-      </w:pPr>
-      <w:r>
-        <w:t>(b) $48^\circ$</w:t>
-      </w:r>
-    </w:p>
-    <w:p>
-      <w:pPr>
-        <w:spacing w:after="80"/>
-      </w:pPr>
-      <w:r>
-        <w:t>(c) $138^\circ$</w:t>
-      </w:r>
-    </w:p>
-    <w:p>
-      <w:pPr>
-        <w:spacing w:after="80"/>
-      </w:pPr>
-      <w:r>
-        <w:t>(d) $90^\circ$</w:t>
-      </w:r>
-    </w:p>
-    <w:p>
-      <w:pPr>
-        <w:pStyle w:val="Heading4"/>
-      </w:pPr>
-      <w:r>
-        <w:rPr>
-          <w:color w:val="334155"/>
-          <w:sz w:val="20"/>
-        </w:rPr>
-        <w:t>II. Fill in the Blanks (1 Mark each)</w:t>
-      </w:r>
-    </w:p>
-    <w:p>
-      <w:pPr>
-        <w:spacing w:after="80"/>
-      </w:pPr>
-      <w:r>
-        <w:t>6. The line segment joining a vertex of a triangle to the midpoint of its opposite side is called a $\underline{\hspace{2cm}}$. `[1]`</w:t>
-      </w:r>
-    </w:p>
-    <w:p>
-      <w:pPr>
-        <w:spacing w:after="80"/>
-      </w:pPr>
-      <w:r>
-        <w:t>7. A triangle cannot have more than $\underline{\hspace{2cm}}$ obtuse angle. `[1]`</w:t>
-      </w:r>
-    </w:p>
-    <w:p>
-      <w:pPr>
-        <w:spacing w:after="80"/>
-      </w:pPr>
-      <w:r>
-        <w:t>8. In any triangle, the side opposite to the largest angle is always the $\underline{\hspace{2cm}}$ side. `[1]`</w:t>
-      </w:r>
-    </w:p>
-    <w:p>
-      <w:pPr>
-        <w:pStyle w:val="Heading4"/>
-      </w:pPr>
-      <w:r>
-        <w:rPr>
-          <w:color w:val="334155"/>
-          <w:sz w:val="20"/>
-        </w:rPr>
-        <w:t>III. True or False (1 Mark each)</w:t>
-      </w:r>
-    </w:p>
-    <w:p>
-      <w:pPr>
-        <w:spacing w:after="80"/>
-      </w:pPr>
-      <w:r>
-        <w:t>9. The sum of any two sides of a triangle must be strictly greater than the third side. `[1]`</w:t>
-      </w:r>
-    </w:p>
-    <w:p>
-      <w:pPr>
-        <w:spacing w:after="80"/>
-      </w:pPr>
-      <w:r>
-        <w:t>10. An equilateral triangle has each angle measuring $60^\circ$. `[1]`</w:t>
-      </w:r>
-    </w:p>
-    <w:p>
-      <w:r>
-        <w:rPr>
-          <w:color w:val="CBD5E1"/>
-        </w:rPr>
-        <w:t>____________________________________________________</w:t>
+        <w:t>4. The product of a fraction and its reciprocal is always: `[1]`</w:t>
+      </w:r>
+    </w:p>
+    <w:p>
+      <w:pPr>
+        <w:spacing w:after="80"/>
+      </w:pPr>
+      <w:r>
+        <w:t>(a) 0</w:t>
+      </w:r>
+    </w:p>
+    <w:p>
+      <w:pPr>
+        <w:spacing w:after="80"/>
+      </w:pPr>
+      <w:r>
+        <w:t>(b) 1</w:t>
+      </w:r>
+    </w:p>
+    <w:p>
+      <w:pPr>
+        <w:spacing w:after="80"/>
+      </w:pPr>
+      <w:r>
+        <w:t>(c) Equal to the fraction</w:t>
+      </w:r>
+    </w:p>
+    <w:p>
+      <w:pPr>
+        <w:spacing w:after="80"/>
+      </w:pPr>
+      <w:r>
+        <w:t>(d) Infinite</w:t>
+      </w:r>
+    </w:p>
+    <w:p>
+      <w:pPr>
+        <w:spacing w:after="80"/>
+      </w:pPr>
+      <w:r>
+        <w:t>5. What is the value of $\frac{3}{7} \times \frac{14}{9}$? `[1]`</w:t>
+      </w:r>
+    </w:p>
+    <w:p>
+      <w:pPr>
+        <w:spacing w:after="80"/>
+      </w:pPr>
+      <w:r>
+        <w:t>(a) $\frac{1}{3}$</w:t>
+      </w:r>
+    </w:p>
+    <w:p>
+      <w:pPr>
+        <w:spacing w:after="80"/>
+      </w:pPr>
+      <w:r>
+        <w:t>(b) $\frac{2}{3}$</w:t>
+      </w:r>
+    </w:p>
+    <w:p>
+      <w:pPr>
+        <w:spacing w:after="80"/>
+      </w:pPr>
+      <w:r>
+        <w:t>(c) $\frac{3}{2}$</w:t>
+      </w:r>
+    </w:p>
+    <w:p>
+      <w:pPr>
+        <w:spacing w:after="80"/>
+      </w:pPr>
+      <w:r>
+        <w:t>(d) $\frac{7}{3}$</w:t>
+      </w:r>
+    </w:p>
+    <w:p>
+      <w:pPr>
+        <w:spacing w:after="80"/>
+      </w:pPr>
+      <w:r>
+        <w:t>6. Fill in the blank: The meeting point of the medians of a triangle is called the $\underline{\hspace{2cm}}$. `[1]`</w:t>
+      </w:r>
+    </w:p>
+    <w:p>
+      <w:pPr>
+        <w:spacing w:after="80"/>
+      </w:pPr>
+      <w:r>
+        <w:t>7. Fill in the blank: $5 \div \frac{1}{3} = \underline{\hspace{2cm}}$. `[1]`</w:t>
+      </w:r>
+    </w:p>
+    <w:p>
+      <w:pPr>
+        <w:spacing w:after="80"/>
+      </w:pPr>
+      <w:r>
+        <w:t>8. Fill in the blank: An altitude of a triangle forms an angle of $\underline{\hspace{2cm}}^\circ$ with the base. `[1]`</w:t>
+      </w:r>
+    </w:p>
+    <w:p>
+      <w:pPr>
+        <w:spacing w:after="80"/>
+      </w:pPr>
+      <w:r>
+        <w:t>9. True or False: Every equilateral triangle is also an isosceles triangle. `[1]`</w:t>
+      </w:r>
+    </w:p>
+    <w:p>
+      <w:pPr>
+        <w:spacing w:after="80"/>
+      </w:pPr>
+      <w:r>
+        <w:t>10. True or False: Dividing a number by $\frac{1}{2}$ is equivalent to doubling the number. `[1]`</w:t>
       </w:r>
     </w:p>
     <w:p>
@@ -403,23 +4069,15 @@
         <w:spacing w:after="80"/>
       </w:pPr>
       <w:r>
-        <w:t>12. In $\triangle ABC$, the exterior angle at vertex $C$ measures $110^\circ$. If one interior opposite angle is $45^\circ$, find the other interior opposite angle. `[2]`</w:t>
-      </w:r>
-    </w:p>
-    <w:p>
-      <w:pPr>
-        <w:spacing w:after="80"/>
-      </w:pPr>
-      <w:r>
-        <w:t>13. Can a triangle have angles measuring $65^\circ, 75^\circ,$ and $50^\circ$? Justify your answer. `[2]`</w:t>
-      </w:r>
-    </w:p>
-    <w:p>
-      <w:r>
-        <w:rPr>
-          <w:color w:val="CBD5E1"/>
-        </w:rPr>
-        <w:t>____________________________________________________</w:t>
+        <w:t>12. Find the reciprocal of $3\frac{2}{5}$. `[2]`</w:t>
+      </w:r>
+    </w:p>
+    <w:p>
+      <w:pPr>
+        <w:spacing w:after="80"/>
+      </w:pPr>
+      <w:r>
+        <w:t>13. In $\triangle ABC$, exterior angle $\angle ACD = 110^\circ$. If interior opposite angle $\angle B = 45^\circ$, find $\angle A$. `[2]`</w:t>
       </w:r>
     </w:p>
     <w:p>
@@ -439,47 +4097,31 @@
         <w:spacing w:after="80"/>
       </w:pPr>
       <w:r>
-        <w:t>14. One of the acute angles of a right-angled triangle is twice the other. Find the measures of both acute angles. `[3]`</w:t>
-      </w:r>
-    </w:p>
-    <w:p>
-      <w:pPr>
-        <w:spacing w:after="80"/>
-      </w:pPr>
-      <w:r>
-        <w:t>15. In $\triangle PQR$, the bisector of $\angle P$ meets $QR$ at $S$. If $\angle Q = 70^\circ$ and $\angle R = 30^\circ$, find $\angle PSR$ and $\angle PSQ$. `[3]`</w:t>
-      </w:r>
-    </w:p>
-    <w:p>
-      <w:pPr>
-        <w:spacing w:after="80"/>
-      </w:pPr>
-      <w:r>
-        <w:t>16. The lengths of two sides of a triangle are $8\text{ cm}$ and $11\text{ cm}$. Between which two numbers must the length of the third side fall? `[3]`</w:t>
-      </w:r>
-    </w:p>
-    <w:p>
-      <w:pPr>
-        <w:spacing w:after="80"/>
-      </w:pPr>
-      <w:r>
-        <w:t>17. In the given figure, find the values of the unknown variables $x$ and $y$:</w:t>
-      </w:r>
-    </w:p>
-    <w:p>
-      <w:pPr>
-        <w:spacing w:after="80"/>
-      </w:pPr>
-      <w:r>
-        <w:t>Exterior angle is $120^\circ$, one interior opposite angle is $x$, the adjacent interior angle is $y$, and the second interior opposite angle is $50^\circ$. `[3]`</w:t>
-      </w:r>
-    </w:p>
-    <w:p>
-      <w:r>
-        <w:rPr>
-          <w:color w:val="CBD5E1"/>
-        </w:rPr>
-        <w:t>____________________________________________________</w:t>
+        <w:t>14. One acute angle of a right-angled triangle is twice the other. Find both acute angles. `[3]`</w:t>
+      </w:r>
+    </w:p>
+    <w:p>
+      <w:pPr>
+        <w:spacing w:after="80"/>
+      </w:pPr>
+      <w:r>
+        <w:t>15. Solve: $3\frac{1}{2} - 1\frac{5}{6} + 2\frac{2}{3}$. `[3]`</w:t>
+      </w:r>
+    </w:p>
+    <w:p>
+      <w:pPr>
+        <w:spacing w:after="80"/>
+      </w:pPr>
+      <w:r>
+        <w:t>16. The sides of a triangle are $8\text{ cm}$ and $11\text{ cm}$. Between which two numbers must the length of the third side fall? `[3]`</w:t>
+      </w:r>
+    </w:p>
+    <w:p>
+      <w:pPr>
+        <w:spacing w:after="80"/>
+      </w:pPr>
+      <w:r>
+        <w:t>17. A rope of length $15\frac{3}{4}\text{ metres}$ is cut into pieces of length $\frac{3}{4}\text{ metre}$ each. How many pieces are obtained? `[3]`</w:t>
       </w:r>
     </w:p>
     <w:p>
@@ -499,31 +4141,15 @@
         <w:spacing w:after="80"/>
       </w:pPr>
       <w:r>
-        <w:t>18. (a) State and prove the **Angle Sum Property of a Triangle** using a parallel auxiliary line.</w:t>
-      </w:r>
-    </w:p>
-    <w:p>
-      <w:pPr>
-        <w:spacing w:after="80"/>
-      </w:pPr>
-      <w:r>
-        <w:t>(b) In $\triangle ABC$, $\angle B = 2\angle A$ and $\angle C = 3\angle A$. Find all three angles and classify the triangle. `[4]`</w:t>
-      </w:r>
-    </w:p>
-    <w:p>
-      <w:pPr>
-        <w:spacing w:after="80"/>
-      </w:pPr>
-      <w:r>
-        <w:t>19. Write down the step-by-step procedure for constructing $\triangle ABC$ where side $AB = 6\text{ cm}$, $\angle A = 60^\circ$, and $\angle B = 45^\circ$ using a ruler, protractor, and compass. Calculate the measure of the third angle $\angle C$. `[4]`</w:t>
-      </w:r>
-    </w:p>
-    <w:p>
-      <w:r>
-        <w:rPr>
-          <w:color w:val="CBD5E1"/>
-        </w:rPr>
-        <w:t>____________________________________________________</w:t>
+        <w:t>18. State and prove the Angle Sum Property of a triangle using a parallel line. `[4]`</w:t>
+      </w:r>
+    </w:p>
+    <w:p>
+      <w:pPr>
+        <w:spacing w:after="80"/>
+      </w:pPr>
+      <w:r>
+        <w:t>19. The area of a rectangular field is $65\frac{1}{3}\text{ m}^2$. If its breadth is $5\frac{1}{3}\text{ m}$, find its length and perimeter. `[4]`</w:t>
       </w:r>
     </w:p>
     <w:p>
@@ -535,15 +4161,15 @@
           <w:color w:val="0369A1"/>
           <w:sz w:val="22"/>
         </w:rPr>
-        <w:t>SECTION E: CASE-STUDY / COMPETENCY-BASED QUESTION (4 Marks)</w:t>
-      </w:r>
-    </w:p>
-    <w:p>
-      <w:pPr>
-        <w:spacing w:after="80"/>
-      </w:pPr>
-      <w:r>
-        <w:t>20. **Case Study: Solar Panel Roof Framing**</w:t>
+        <w:t>SECTION E: CASE STUDY / COMPETENCY-BASED QUESTION (4 Marks)</w:t>
+      </w:r>
+    </w:p>
+    <w:p>
+      <w:pPr>
+        <w:spacing w:after="80"/>
+      </w:pPr>
+      <w:r>
+        <w:t>20. **Solar Panel Rooftop Truss:**</w:t>
       </w:r>
     </w:p>
     <w:p>
@@ -569,7 +4195,7 @@
         <w:spacing w:after="40"/>
       </w:pPr>
       <w:r>
-        <w:t>Support strut $AB$ makes an inclination of $35^\circ$ with the horizontal ($ \angle B = 35^\circ $).</w:t>
+        <w:t>Strut $AB$ has inclination $\angle B = 35^\circ$ with the horizontal.</w:t>
       </w:r>
     </w:p>
     <w:p>
@@ -578,7 +4204,7 @@
         <w:spacing w:after="40"/>
       </w:pPr>
       <w:r>
-        <w:t>Ridge angle at vertex $A$ is designed to be $85^\circ$ ($ \angle A = 85^\circ $).</w:t>
+        <w:t>Ridge angle $\angle A = 85^\circ$.</w:t>
       </w:r>
     </w:p>
     <w:p>
@@ -594,7 +4220,7 @@
         <w:spacing w:after="80"/>
       </w:pPr>
       <w:r>
-        <w:t>(b) If an exterior gusset plate at vertex $B$ measures the exterior angle, what is its value? `[1]`</w:t>
+        <w:t>(b) If an exterior bracket at vertex $B$ measures the exterior angle, what is its value? `[1]`</w:t>
       </w:r>
     </w:p>
     <w:p>
@@ -603,661 +4229,6 @@
       </w:pPr>
       <w:r>
         <w:t>(c) If strut $AB = 4.2\text{ m}$ and strut $AC = 2.8\text{ m}$, what is the theoretical maximum allowable length for the base beam $BC$ to keep the truss rigid? `[2]`</w:t>
-      </w:r>
-    </w:p>
-    <w:p>
-      <w:r>
-        <w:rPr>
-          <w:color w:val="CBD5E1"/>
-        </w:rPr>
-        <w:t>____________________________________________________</w:t>
-      </w:r>
-    </w:p>
-    <w:p>
-      <w:pPr>
-        <w:pStyle w:val="Heading1"/>
-      </w:pPr>
-      <w:r>
-        <w:rPr>
-          <w:color w:val="0369A1"/>
-          <w:sz w:val="36"/>
-        </w:rPr>
-        <w:t>SOLVERS MATHEMATICS — CLASS 7</w:t>
-      </w:r>
-    </w:p>
-    <w:p>
-      <w:pPr>
-        <w:pStyle w:val="Heading2"/>
-      </w:pPr>
-      <w:r>
-        <w:rPr>
-          <w:color w:val="0F172A"/>
-          <w:sz w:val="26"/>
-        </w:rPr>
-        <w:t>CHAPTER 8: WORKING WITH FRACTIONS</w:t>
-      </w:r>
-    </w:p>
-    <w:p>
-      <w:pPr>
-        <w:pStyle w:val="Heading3"/>
-      </w:pPr>
-      <w:r>
-        <w:rPr>
-          <w:color w:val="0369A1"/>
-          <w:sz w:val="22"/>
-        </w:rPr>
-        <w:t>CHAPTER ASSESSMENT TEST PAPER</w:t>
-      </w:r>
-    </w:p>
-    <w:p>
-      <w:pPr>
-        <w:spacing w:after="80"/>
-      </w:pPr>
-      <w:r>
-        <w:t>**Time Allowed:** 1 Hour | **Maximum Marks:** 40 Marks</w:t>
-      </w:r>
-    </w:p>
-    <w:p>
-      <w:r>
-        <w:rPr>
-          <w:color w:val="CBD5E1"/>
-        </w:rPr>
-        <w:t>____________________________________________________</w:t>
-      </w:r>
-    </w:p>
-    <w:p>
-      <w:pPr>
-        <w:pStyle w:val="Heading3"/>
-      </w:pPr>
-      <w:r>
-        <w:rPr>
-          <w:color w:val="0369A1"/>
-          <w:sz w:val="22"/>
-        </w:rPr>
-        <w:t>SECTION A: OBJECTIVE TYPE QUESTIONS (10 Marks)</w:t>
-      </w:r>
-    </w:p>
-    <w:p>
-      <w:pPr>
-        <w:pStyle w:val="Heading4"/>
-      </w:pPr>
-      <w:r>
-        <w:rPr>
-          <w:color w:val="334155"/>
-          <w:sz w:val="20"/>
-        </w:rPr>
-        <w:t>I. Multiple Choice Questions (1 Mark each)</w:t>
-      </w:r>
-    </w:p>
-    <w:p>
-      <w:pPr>
-        <w:spacing w:after="80"/>
-      </w:pPr>
-      <w:r>
-        <w:t>1. A fraction whose numerator is greater than its denominator is called a/an: `[1]`</w:t>
-      </w:r>
-    </w:p>
-    <w:p>
-      <w:pPr>
-        <w:spacing w:after="80"/>
-      </w:pPr>
-      <w:r>
-        <w:t>(a) Proper fraction</w:t>
-      </w:r>
-    </w:p>
-    <w:p>
-      <w:pPr>
-        <w:spacing w:after="80"/>
-      </w:pPr>
-      <w:r>
-        <w:t>(b) Improper fraction</w:t>
-      </w:r>
-    </w:p>
-    <w:p>
-      <w:pPr>
-        <w:spacing w:after="80"/>
-      </w:pPr>
-      <w:r>
-        <w:t>(c) Unit fraction</w:t>
-      </w:r>
-    </w:p>
-    <w:p>
-      <w:pPr>
-        <w:spacing w:after="80"/>
-      </w:pPr>
-      <w:r>
-        <w:t>(d) Equivalent fraction</w:t>
-      </w:r>
-    </w:p>
-    <w:p>
-      <w:pPr>
-        <w:spacing w:after="80"/>
-      </w:pPr>
-      <w:r>
-        <w:t>2. The reciprocal of $2\frac{3}{5}$ is: `[1]`</w:t>
-      </w:r>
-    </w:p>
-    <w:p>
-      <w:pPr>
-        <w:spacing w:after="80"/>
-      </w:pPr>
-      <w:r>
-        <w:t>(a) $\frac{5}{13}$</w:t>
-      </w:r>
-    </w:p>
-    <w:p>
-      <w:pPr>
-        <w:spacing w:after="80"/>
-      </w:pPr>
-      <w:r>
-        <w:t>(b) $\frac{13}{5}$</w:t>
-      </w:r>
-    </w:p>
-    <w:p>
-      <w:pPr>
-        <w:spacing w:after="80"/>
-      </w:pPr>
-      <w:r>
-        <w:t>(c) $2\frac{5}{3}$</w:t>
-      </w:r>
-    </w:p>
-    <w:p>
-      <w:pPr>
-        <w:spacing w:after="80"/>
-      </w:pPr>
-      <w:r>
-        <w:t>(d) $\frac{5}{6}$</w:t>
-      </w:r>
-    </w:p>
-    <w:p>
-      <w:pPr>
-        <w:spacing w:after="80"/>
-      </w:pPr>
-      <w:r>
-        <w:t>3. The product of $\frac{4}{7} \times \frac{21}{16}$ in simplest form is: `[1]`</w:t>
-      </w:r>
-    </w:p>
-    <w:p>
-      <w:pPr>
-        <w:spacing w:after="80"/>
-      </w:pPr>
-      <w:r>
-        <w:t>(a) $\frac{3}{4}$</w:t>
-      </w:r>
-    </w:p>
-    <w:p>
-      <w:pPr>
-        <w:spacing w:after="80"/>
-      </w:pPr>
-      <w:r>
-        <w:t>(b) $\frac{7}{4}$</w:t>
-      </w:r>
-    </w:p>
-    <w:p>
-      <w:pPr>
-        <w:spacing w:after="80"/>
-      </w:pPr>
-      <w:r>
-        <w:t>(c) $\frac{4}{3}$</w:t>
-      </w:r>
-    </w:p>
-    <w:p>
-      <w:pPr>
-        <w:spacing w:after="80"/>
-      </w:pPr>
-      <w:r>
-        <w:t>(d) $\frac{84}{112}$</w:t>
-      </w:r>
-    </w:p>
-    <w:p>
-      <w:pPr>
-        <w:spacing w:after="80"/>
-      </w:pPr>
-      <w:r>
-        <w:t>4. Which of the following fractions is in simplest irreducible form? `[1]`</w:t>
-      </w:r>
-    </w:p>
-    <w:p>
-      <w:pPr>
-        <w:spacing w:after="80"/>
-      </w:pPr>
-      <w:r>
-        <w:t>(a) $\frac{9}{21}$</w:t>
-      </w:r>
-    </w:p>
-    <w:p>
-      <w:pPr>
-        <w:spacing w:after="80"/>
-      </w:pPr>
-      <w:r>
-        <w:t>(b) $\frac{15}{25}$</w:t>
-      </w:r>
-    </w:p>
-    <w:p>
-      <w:pPr>
-        <w:spacing w:after="80"/>
-      </w:pPr>
-      <w:r>
-        <w:t>(c) $\frac{8}{15}$</w:t>
-      </w:r>
-    </w:p>
-    <w:p>
-      <w:pPr>
-        <w:spacing w:after="80"/>
-      </w:pPr>
-      <w:r>
-        <w:t>(d) $\frac{14}{49}$</w:t>
-      </w:r>
-    </w:p>
-    <w:p>
-      <w:pPr>
-        <w:spacing w:after="80"/>
-      </w:pPr>
-      <w:r>
-        <w:t>5. What is the value of $\frac{3}{4} \div \frac{9}{8}$? `[1]`</w:t>
-      </w:r>
-    </w:p>
-    <w:p>
-      <w:pPr>
-        <w:spacing w:after="80"/>
-      </w:pPr>
-      <w:r>
-        <w:t>(a) $\frac{2}{3}$</w:t>
-      </w:r>
-    </w:p>
-    <w:p>
-      <w:pPr>
-        <w:spacing w:after="80"/>
-      </w:pPr>
-      <w:r>
-        <w:t>(b) $\frac{3}{2}$</w:t>
-      </w:r>
-    </w:p>
-    <w:p>
-      <w:pPr>
-        <w:spacing w:after="80"/>
-      </w:pPr>
-      <w:r>
-        <w:t>(c) $\frac{27}{32}$</w:t>
-      </w:r>
-    </w:p>
-    <w:p>
-      <w:pPr>
-        <w:spacing w:after="80"/>
-      </w:pPr>
-      <w:r>
-        <w:t>(d) $\frac{1}{2}$</w:t>
-      </w:r>
-    </w:p>
-    <w:p>
-      <w:pPr>
-        <w:pStyle w:val="Heading4"/>
-      </w:pPr>
-      <w:r>
-        <w:rPr>
-          <w:color w:val="334155"/>
-          <w:sz w:val="20"/>
-        </w:rPr>
-        <w:t>II. Fill in the Blanks (1 Mark each)</w:t>
-      </w:r>
-    </w:p>
-    <w:p>
-      <w:pPr>
-        <w:spacing w:after="80"/>
-      </w:pPr>
-      <w:r>
-        <w:t>6. $\frac{3}{8} + \frac{5}{8} = \underline{\hspace{2cm}}$. `[1]`</w:t>
-      </w:r>
-    </w:p>
-    <w:p>
-      <w:pPr>
-        <w:spacing w:after="80"/>
-      </w:pPr>
-      <w:r>
-        <w:t>7. To divide a fraction by another fraction, we multiply the first fraction by the $\underline{\hspace{2cm}}$ of the second fraction. `[1]`</w:t>
-      </w:r>
-    </w:p>
-    <w:p>
-      <w:pPr>
-        <w:spacing w:after="80"/>
-      </w:pPr>
-      <w:r>
-        <w:t>8. $\frac{2}{5}$ of $40\text{ kg} = \underline{\hspace{2cm}}\text{ kg}$. `[1]`</w:t>
-      </w:r>
-    </w:p>
-    <w:p>
-      <w:pPr>
-        <w:pStyle w:val="Heading4"/>
-      </w:pPr>
-      <w:r>
-        <w:rPr>
-          <w:color w:val="334155"/>
-          <w:sz w:val="20"/>
-        </w:rPr>
-        <w:t>III. True or False (1 Mark each)</w:t>
-      </w:r>
-    </w:p>
-    <w:p>
-      <w:pPr>
-        <w:spacing w:after="80"/>
-      </w:pPr>
-      <w:r>
-        <w:t>9. Multiplying a proper fraction by another proper fraction always yields a product smaller than each of the fractions. `[1]`</w:t>
-      </w:r>
-    </w:p>
-    <w:p>
-      <w:pPr>
-        <w:spacing w:after="80"/>
-      </w:pPr>
-      <w:r>
-        <w:t>10. The fraction $\frac{0}{5}$ has no reciprocal. `[1]`</w:t>
-      </w:r>
-    </w:p>
-    <w:p>
-      <w:r>
-        <w:rPr>
-          <w:color w:val="CBD5E1"/>
-        </w:rPr>
-        <w:t>____________________________________________________</w:t>
-      </w:r>
-    </w:p>
-    <w:p>
-      <w:pPr>
-        <w:pStyle w:val="Heading3"/>
-      </w:pPr>
-      <w:r>
-        <w:rPr>
-          <w:color w:val="0369A1"/>
-          <w:sz w:val="22"/>
-        </w:rPr>
-        <w:t>SECTION B: VERY SHORT ANSWER QUESTIONS (6 Marks)</w:t>
-      </w:r>
-    </w:p>
-    <w:p>
-      <w:pPr>
-        <w:spacing w:after="80"/>
-      </w:pPr>
-      <w:r>
-        <w:t>11. Convert $\frac{43}{6}$ into a mixed fraction. `[2]`</w:t>
-      </w:r>
-    </w:p>
-    <w:p>
-      <w:pPr>
-        <w:spacing w:after="80"/>
-      </w:pPr>
-      <w:r>
-        <w:t>12. Find an equivalent fraction of $\frac{3}{7}$ having denominator $35$. `[2]`</w:t>
-      </w:r>
-    </w:p>
-    <w:p>
-      <w:pPr>
-        <w:spacing w:after="80"/>
-      </w:pPr>
-      <w:r>
-        <w:t>13. Compare using $&gt;$, $&lt;$, or $=$: `[2]`</w:t>
-      </w:r>
-    </w:p>
-    <w:p>
-      <w:pPr>
-        <w:spacing w:after="80"/>
-      </w:pPr>
-      <w:r>
-        <w:t>$$\frac{5}{8} \quad \Box \quad \frac{7}{12}$$</w:t>
-      </w:r>
-    </w:p>
-    <w:p>
-      <w:r>
-        <w:rPr>
-          <w:color w:val="CBD5E1"/>
-        </w:rPr>
-        <w:t>____________________________________________________</w:t>
-      </w:r>
-    </w:p>
-    <w:p>
-      <w:pPr>
-        <w:pStyle w:val="Heading3"/>
-      </w:pPr>
-      <w:r>
-        <w:rPr>
-          <w:color w:val="0369A1"/>
-          <w:sz w:val="22"/>
-        </w:rPr>
-        <w:t>SECTION C: SHORT ANSWER QUESTIONS (12 Marks)</w:t>
-      </w:r>
-    </w:p>
-    <w:p>
-      <w:pPr>
-        <w:spacing w:after="80"/>
-      </w:pPr>
-      <w:r>
-        <w:t>14. Evaluate step-by-step: `[3]`</w:t>
-      </w:r>
-    </w:p>
-    <w:p>
-      <w:pPr>
-        <w:spacing w:after="80"/>
-      </w:pPr>
-      <w:r>
-        <w:t>$$3\frac{1}{4} + 2\frac{2}{5} - 1\frac{1}{2}$$</w:t>
-      </w:r>
-    </w:p>
-    <w:p>
-      <w:pPr>
-        <w:spacing w:after="80"/>
-      </w:pPr>
-      <w:r>
-        <w:t>15. A rectangular photo frame has length $12\frac{1}{2}\text{ cm}$ and breadth $8\frac{2}{3}\text{ cm}$. Find:</w:t>
-      </w:r>
-    </w:p>
-    <w:p>
-      <w:pPr>
-        <w:spacing w:after="80"/>
-      </w:pPr>
-      <w:r>
-        <w:t>(a) The perimeter of the frame.</w:t>
-      </w:r>
-    </w:p>
-    <w:p>
-      <w:pPr>
-        <w:spacing w:after="80"/>
-      </w:pPr>
-      <w:r>
-        <w:t>(b) The area of the frame. `[3]`</w:t>
-      </w:r>
-    </w:p>
-    <w:p>
-      <w:pPr>
-        <w:spacing w:after="80"/>
-      </w:pPr>
-      <w:r>
-        <w:t>16. Evaluate: `[3]`</w:t>
-      </w:r>
-    </w:p>
-    <w:p>
-      <w:pPr>
-        <w:spacing w:after="80"/>
-      </w:pPr>
-      <w:r>
-        <w:t>$$\left( \frac{5}{14} \times \frac{21}{25} \right) \div \frac{9}{10}$$</w:t>
-      </w:r>
-    </w:p>
-    <w:p>
-      <w:pPr>
-        <w:spacing w:after="80"/>
-      </w:pPr>
-      <w:r>
-        <w:t>17. A ribbon of length $15\frac{3}{4}\text{ m}$ is cut into equal pieces, each of length $1\frac{3}{4}\text{ m}$. How many pieces are obtained? `[3]`</w:t>
-      </w:r>
-    </w:p>
-    <w:p>
-      <w:r>
-        <w:rPr>
-          <w:color w:val="CBD5E1"/>
-        </w:rPr>
-        <w:t>____________________________________________________</w:t>
-      </w:r>
-    </w:p>
-    <w:p>
-      <w:pPr>
-        <w:pStyle w:val="Heading3"/>
-      </w:pPr>
-      <w:r>
-        <w:rPr>
-          <w:color w:val="0369A1"/>
-          <w:sz w:val="22"/>
-        </w:rPr>
-        <w:t>SECTION D: LONG ANSWER QUESTIONS (8 Marks)</w:t>
-      </w:r>
-    </w:p>
-    <w:p>
-      <w:pPr>
-        <w:spacing w:after="80"/>
-      </w:pPr>
-      <w:r>
-        <w:t>18. (a) In a library, $\frac{2}{5}$ of the books are in English, $\frac{1}{3}$ are in Hindi, and the remaining 480 books are in regional languages.</w:t>
-      </w:r>
-    </w:p>
-    <w:p>
-      <w:pPr>
-        <w:spacing w:after="80"/>
-      </w:pPr>
-      <w:r>
-        <w:t>Find the total number of books in the library.</w:t>
-      </w:r>
-    </w:p>
-    <w:p>
-      <w:pPr>
-        <w:spacing w:after="80"/>
-      </w:pPr>
-      <w:r>
-        <w:t>(b) How many books are in English, and how many are in Hindi? `[4]`</w:t>
-      </w:r>
-    </w:p>
-    <w:p>
-      <w:pPr>
-        <w:spacing w:after="80"/>
-      </w:pPr>
-      <w:r>
-        <w:t>19. (a) Illustrate the multiplication $\frac{2}{3} \times \frac{3}{4}$ using an area partition grid model and calculate the product in simplest form.</w:t>
-      </w:r>
-    </w:p>
-    <w:p>
-      <w:pPr>
-        <w:spacing w:after="80"/>
-      </w:pPr>
-      <w:r>
-        <w:t>(b) Evaluate: `[4]`</w:t>
-      </w:r>
-    </w:p>
-    <w:p>
-      <w:pPr>
-        <w:spacing w:after="80"/>
-      </w:pPr>
-      <w:r>
-        <w:t>$$5\frac{1}{3} \div \left[ 2\frac{2}{3} + \left\{ 1\frac{1}{2} \times \left( \frac{4}{5} - \frac{2}{5} \right) \right\} \right]$$</w:t>
-      </w:r>
-    </w:p>
-    <w:p>
-      <w:r>
-        <w:rPr>
-          <w:color w:val="CBD5E1"/>
-        </w:rPr>
-        <w:t>____________________________________________________</w:t>
-      </w:r>
-    </w:p>
-    <w:p>
-      <w:pPr>
-        <w:pStyle w:val="Heading3"/>
-      </w:pPr>
-      <w:r>
-        <w:rPr>
-          <w:color w:val="0369A1"/>
-          <w:sz w:val="22"/>
-        </w:rPr>
-        <w:t>SECTION E: CASE-STUDY / COMPETENCY-BASED QUESTION (4 Marks)</w:t>
-      </w:r>
-    </w:p>
-    <w:p>
-      <w:pPr>
-        <w:spacing w:after="80"/>
-      </w:pPr>
-      <w:r>
-        <w:t>20. **Case Study: Community Kitchen Baking Recipe**</w:t>
-      </w:r>
-    </w:p>
-    <w:p>
-      <w:pPr>
-        <w:spacing w:after="80"/>
-      </w:pPr>
-      <w:r>
-        <w:t>A community bakery prepares special artisan bread loaves. The standard recipe for one batch requires:</w:t>
-      </w:r>
-    </w:p>
-    <w:p>
-      <w:pPr>
-        <w:pStyle w:val="ListBullet"/>
-        <w:spacing w:after="40"/>
-      </w:pPr>
-      <w:r>
-        <w:t>$3\frac{1}{2}\text{ cups}$ of whole wheat flour</w:t>
-      </w:r>
-    </w:p>
-    <w:p>
-      <w:pPr>
-        <w:pStyle w:val="ListBullet"/>
-        <w:spacing w:after="40"/>
-      </w:pPr>
-      <w:r>
-        <w:t>$\frac{3}{4}\text{ cup}$ of warm milk</w:t>
-      </w:r>
-    </w:p>
-    <w:p>
-      <w:pPr>
-        <w:pStyle w:val="ListBullet"/>
-        <w:spacing w:after="40"/>
-      </w:pPr>
-      <w:r>
-        <w:t>$\frac{2}{3}\text{ cup}$ of natural honey</w:t>
-      </w:r>
-    </w:p>
-    <w:p>
-      <w:pPr>
-        <w:spacing w:after="80"/>
-      </w:pPr>
-      <w:r>
-        <w:t>On Saturday, the master baker decides to make $4\frac{1}{2}$ batches to supply a food festival.</w:t>
-      </w:r>
-    </w:p>
-    <w:p>
-      <w:pPr>
-        <w:spacing w:after="80"/>
-      </w:pPr>
-      <w:r>
-        <w:t>(a) How much warm milk is required for all $4\frac{1}{2}$ batches? `[1]`</w:t>
-      </w:r>
-    </w:p>
-    <w:p>
-      <w:pPr>
-        <w:spacing w:after="80"/>
-      </w:pPr>
-      <w:r>
-        <w:t>(b) How much honey is required for all $4\frac{1}{2}$ batches? `[1]`</w:t>
-      </w:r>
-    </w:p>
-    <w:p>
-      <w:pPr>
-        <w:spacing w:after="80"/>
-      </w:pPr>
-      <w:r>
-        <w:t>(c) If the bakery has a $15\text{-cup}$ sack of wheat flour, is it sufficient to bake all $4\frac{1}{2}$ batches? Calculate the exact surplus or shortage. `[2]`</w:t>
-      </w:r>
-    </w:p>
-    <w:p>
-      <w:r>
-        <w:rPr>
-          <w:color w:val="CBD5E1"/>
-        </w:rPr>
-        <w:t>____________________________________________________</w:t>
       </w:r>
     </w:p>
     <w:sectPr>

</xml_diff>